<commit_message>
Updating file with Prompt of 'formatizing content for jupyter notebook's cell'
</commit_message>
<xml_diff>
--- a/Important Prompts/1_Handwritten_Content_and_Copywritting_Prompts.docx
+++ b/Important Prompts/1_Handwritten_Content_and_Copywritting_Prompts.docx
@@ -3131,7 +3131,13 @@
       </w:pPr>
       <w:r>
         <w:lastRenderedPageBreak/>
-        <w:t>The post shows relevancy to my field of Interest.</w:t>
+        <w:t>The post shows relevanc</w:t>
+      </w:r>
+      <w:r>
+        <w:t>e</w:t>
+      </w:r>
+      <w:r>
+        <w:t xml:space="preserve"> to my field of Interest.</w:t>
       </w:r>
     </w:p>
     <w:p>
@@ -3143,7 +3149,19 @@
         </w:numPr>
       </w:pPr>
       <w:r>
-        <w:t>The Post should be designed according to algorithm of the LinkedIn (e.g. using SEO-based keywords) to get more impressions and views.</w:t>
+        <w:t xml:space="preserve">The Post should be designed according to </w:t>
+      </w:r>
+      <w:r>
+        <w:t xml:space="preserve">the </w:t>
+      </w:r>
+      <w:r>
+        <w:t>algorithm of LinkedIn (e.g.</w:t>
+      </w:r>
+      <w:r>
+        <w:t>,</w:t>
+      </w:r>
+      <w:r>
+        <w:t xml:space="preserve"> using SEO-based keywords) to get more impressions and views.</w:t>
       </w:r>
     </w:p>
     <w:p>
@@ -3182,7 +3200,13 @@
         </w:numPr>
       </w:pPr>
       <w:r>
-        <w:t>The post should have links for the GitHub repo, drive links for documents, etc.</w:t>
+        <w:t xml:space="preserve">The post should have links for the GitHub repo, </w:t>
+      </w:r>
+      <w:r>
+        <w:t>D</w:t>
+      </w:r>
+      <w:r>
+        <w:t>rive links for documents, etc.</w:t>
       </w:r>
     </w:p>
     <w:p>
@@ -3232,10 +3256,360 @@
     </w:p>
     <w:p>
       <w:pPr>
-        <w:rPr>
+        <w:pStyle w:val="Heading1"/>
+      </w:pPr>
+      <w:r>
+        <w:t>Prompt to generate a LinkedIn post for your learning in any course/field/topic</w:t>
+      </w:r>
+    </w:p>
+    <w:p>
+      <w:pPr>
+        <w:rPr>
+          <w:b/>
+          <w:bCs/>
+        </w:rPr>
+      </w:pPr>
+      <w:r>
+        <w:rPr>
+          <w:b/>
+          <w:bCs/>
+        </w:rPr>
+        <w:t xml:space="preserve">Upload </w:t>
+      </w:r>
+      <w:r>
+        <w:rPr>
+          <w:b/>
+          <w:bCs/>
+        </w:rPr>
+        <w:t xml:space="preserve">the </w:t>
+      </w:r>
+      <w:r>
+        <w:rPr>
+          <w:b/>
+          <w:bCs/>
+        </w:rPr>
+        <w:t>document of learning:</w:t>
+      </w:r>
+    </w:p>
+    <w:p>
+      <w:pPr>
+        <w:rPr>
+          <w:b/>
+          <w:bCs/>
           <w:lang w:val="en-US"/>
         </w:rPr>
       </w:pPr>
+      <w:r>
+        <w:rPr>
+          <w:b/>
+          <w:bCs/>
+          <w:lang w:val="en-US"/>
+        </w:rPr>
+        <w:t>Context:</w:t>
+      </w:r>
+    </w:p>
+    <w:p>
+      <w:pPr>
+        <w:rPr>
+          <w:lang w:val="en-US"/>
+        </w:rPr>
+      </w:pPr>
+      <w:r>
+        <w:rPr>
+          <w:lang w:val="en-US"/>
+        </w:rPr>
+        <w:t>I am an “aspiring “Data Analyst, Data Scientist, and Passionate AI Engineer”. I have completed my course/research/learning in this “field”. I want to share my course/research/learning on LinkedIn to show my progress in my field of Interest.</w:t>
+      </w:r>
+    </w:p>
+    <w:p>
+      <w:pPr>
+        <w:rPr>
+          <w:b/>
+          <w:bCs/>
+          <w:lang w:val="en-US"/>
+        </w:rPr>
+      </w:pPr>
+      <w:r>
+        <w:rPr>
+          <w:b/>
+          <w:bCs/>
+          <w:lang w:val="en-US"/>
+        </w:rPr>
+        <w:t>Task:</w:t>
+      </w:r>
+    </w:p>
+    <w:p>
+      <w:r>
+        <w:t>I want you to behave like an expert Content Writer, an expert Copywriter specializing in Post writing, and an SEO-based keyword specialist. What you have to do is that I will give you the Data(which gives you information about the course), and utilizing this data, you have to design a LinkedIn post to share my learnings(MS Word OR PDF document) of the topic on LinkedIn according to the instructions given.</w:t>
+      </w:r>
+    </w:p>
+    <w:p>
+      <w:pPr>
+        <w:rPr>
+          <w:b/>
+          <w:bCs/>
+        </w:rPr>
+      </w:pPr>
+      <w:r>
+        <w:rPr>
+          <w:b/>
+          <w:bCs/>
+        </w:rPr>
+        <w:t>Instructions:</w:t>
+      </w:r>
+    </w:p>
+    <w:p>
+      <w:pPr>
+        <w:rPr>
+          <w:b/>
+          <w:bCs/>
+        </w:rPr>
+      </w:pPr>
+      <w:r>
+        <w:rPr>
+          <w:b/>
+          <w:bCs/>
+        </w:rPr>
+        <w:t>For Post:</w:t>
+      </w:r>
+    </w:p>
+    <w:p>
+      <w:pPr>
+        <w:pStyle w:val="ListParagraph"/>
+        <w:numPr>
+          <w:ilvl w:val="0"/>
+          <w:numId w:val="17"/>
+        </w:numPr>
+      </w:pPr>
+      <w:r>
+        <w:t xml:space="preserve">The </w:t>
+      </w:r>
+      <w:r>
+        <w:t xml:space="preserve">start of the </w:t>
+      </w:r>
+      <w:r>
+        <w:t>post should reflect a sense of joy that I</w:t>
+      </w:r>
+      <w:r>
+        <w:t>’m happy to share my learnings or notes</w:t>
+      </w:r>
+      <w:r>
+        <w:t xml:space="preserve"> of the course</w:t>
+      </w:r>
+      <w:r>
+        <w:t xml:space="preserve"> with the people.</w:t>
+      </w:r>
+    </w:p>
+    <w:p>
+      <w:pPr>
+        <w:pStyle w:val="ListParagraph"/>
+        <w:numPr>
+          <w:ilvl w:val="0"/>
+          <w:numId w:val="17"/>
+        </w:numPr>
+      </w:pPr>
+      <w:r>
+        <w:t>The post should tell the objectives of my learning.</w:t>
+      </w:r>
+    </w:p>
+    <w:p>
+      <w:pPr>
+        <w:pStyle w:val="ListParagraph"/>
+        <w:numPr>
+          <w:ilvl w:val="0"/>
+          <w:numId w:val="17"/>
+        </w:numPr>
+      </w:pPr>
+      <w:r>
+        <w:t>The post should tell that I want to share my learning on LinkedIn to help others or to share my knowledge.</w:t>
+      </w:r>
+    </w:p>
+    <w:p>
+      <w:pPr>
+        <w:pStyle w:val="ListParagraph"/>
+        <w:numPr>
+          <w:ilvl w:val="0"/>
+          <w:numId w:val="17"/>
+        </w:numPr>
+      </w:pPr>
+      <w:r>
+        <w:t>The Post should tell why this learning is important in my field of interest and how it has helped me to improve my skills.</w:t>
+      </w:r>
+    </w:p>
+    <w:p>
+      <w:pPr>
+        <w:pStyle w:val="ListParagraph"/>
+        <w:numPr>
+          <w:ilvl w:val="0"/>
+          <w:numId w:val="17"/>
+        </w:numPr>
+      </w:pPr>
+      <w:r>
+        <w:t>The post shows relevance to my field of Interest.</w:t>
+      </w:r>
+    </w:p>
+    <w:p>
+      <w:pPr>
+        <w:pStyle w:val="ListParagraph"/>
+        <w:numPr>
+          <w:ilvl w:val="0"/>
+          <w:numId w:val="17"/>
+        </w:numPr>
+      </w:pPr>
+      <w:r>
+        <w:t>The Post should be designed according to the algorithm of LinkedIn (e.g., using SEO-based keywords) to get more impressions and views.</w:t>
+      </w:r>
+    </w:p>
+    <w:p>
+      <w:pPr>
+        <w:pStyle w:val="ListParagraph"/>
+        <w:numPr>
+          <w:ilvl w:val="0"/>
+          <w:numId w:val="17"/>
+        </w:numPr>
+      </w:pPr>
+      <w:r>
+        <w:lastRenderedPageBreak/>
+        <w:t>The Post should be designed in a way that the LinkedIn algorithm will suggest my post when someone searches for anything related to my field of interest.</w:t>
+      </w:r>
+    </w:p>
+    <w:p>
+      <w:pPr>
+        <w:pStyle w:val="ListParagraph"/>
+        <w:numPr>
+          <w:ilvl w:val="0"/>
+          <w:numId w:val="17"/>
+        </w:numPr>
+      </w:pPr>
+      <w:r>
+        <w:t>The post should be well-defined and well-written.</w:t>
+      </w:r>
+    </w:p>
+    <w:p>
+      <w:pPr>
+        <w:pStyle w:val="ListParagraph"/>
+        <w:numPr>
+          <w:ilvl w:val="0"/>
+          <w:numId w:val="17"/>
+        </w:numPr>
+      </w:pPr>
+      <w:r>
+        <w:t>The post should have links for the GitHub repo, Drive links for documents, etc.</w:t>
+      </w:r>
+    </w:p>
+    <w:p>
+      <w:pPr>
+        <w:pStyle w:val="ListParagraph"/>
+        <w:numPr>
+          <w:ilvl w:val="0"/>
+          <w:numId w:val="17"/>
+        </w:numPr>
+      </w:pPr>
+      <w:r>
+        <w:t>Please avoid using icons inside posts, because icons affect the visibility and reach of the post.</w:t>
+      </w:r>
+    </w:p>
+    <w:p>
+      <w:pPr>
+        <w:pStyle w:val="ListParagraph"/>
+        <w:numPr>
+          <w:ilvl w:val="0"/>
+          <w:numId w:val="17"/>
+        </w:numPr>
+      </w:pPr>
+      <w:r>
+        <w:t>The post should be concise and to the point, but not too short.</w:t>
+      </w:r>
+    </w:p>
+    <w:p>
+      <w:pPr>
+        <w:rPr>
+          <w:b/>
+          <w:bCs/>
+          <w:lang w:val="en-US"/>
+        </w:rPr>
+      </w:pPr>
+      <w:r>
+        <w:rPr>
+          <w:b/>
+          <w:bCs/>
+          <w:lang w:val="en-US"/>
+        </w:rPr>
+        <w:t>Data:</w:t>
+      </w:r>
+    </w:p>
+    <w:p>
+      <w:pPr>
+        <w:rPr>
+          <w:lang w:val="en-US"/>
+        </w:rPr>
+      </w:pPr>
+      <w:r>
+        <w:rPr>
+          <w:lang w:val="en-US"/>
+        </w:rPr>
+        <w:t>The Data of the course is “    ”</w:t>
+      </w:r>
+    </w:p>
+    <w:p>
+      <w:pPr>
+        <w:rPr>
+          <w:lang w:val="en-US"/>
+        </w:rPr>
+      </w:pPr>
+    </w:p>
+    <w:p>
+      <w:pPr>
+        <w:pStyle w:val="Heading1"/>
+      </w:pPr>
+      <w:r>
+        <w:t>Prompt for Formatting content for the Jupyter Notebook’s Markdown cell:</w:t>
+      </w:r>
+    </w:p>
+    <w:p>
+      <w:r>
+        <w:t xml:space="preserve">Can you format this content for Jupyter Notebook's markdown cell so that when I run the cell, it displays correctly? </w:t>
+      </w:r>
+    </w:p>
+    <w:p>
+      <w:r>
+        <w:t xml:space="preserve">Note: </w:t>
+      </w:r>
+    </w:p>
+    <w:p>
+      <w:r>
+        <w:t xml:space="preserve">1. Heading style according to the Number of Topics and their heading types(heading 1, heading 2, heading 3), but now the heading number should start from heading 4. </w:t>
+      </w:r>
+    </w:p>
+    <w:p>
+      <w:r>
+        <w:t xml:space="preserve">2. Correct any spelling mistakes, if any. </w:t>
+      </w:r>
+    </w:p>
+    <w:p>
+      <w:r>
+        <w:t xml:space="preserve">3. If content has columns and rows, formatize it according to a table. </w:t>
+      </w:r>
+    </w:p>
+    <w:p>
+      <w:r>
+        <w:t xml:space="preserve">4. Give bullet points, numbering, or icons based on the type of content. </w:t>
+      </w:r>
+    </w:p>
+    <w:p>
+      <w:r>
+        <w:t xml:space="preserve">Content:" </w:t>
+      </w:r>
+    </w:p>
+    <w:p>
+      <w:pPr>
+        <w:rPr>
+          <w:lang w:val="en-US"/>
+        </w:rPr>
+      </w:pPr>
+      <w:r>
+        <w:t>".</w:t>
+      </w:r>
     </w:p>
     <w:sectPr>
       <w:pgSz w:w="11906" w:h="16838"/>
@@ -3974,6 +4348,92 @@
     </w:lvl>
   </w:abstractNum>
   <w:abstractNum w:abstractNumId="8" w15:restartNumberingAfterBreak="0">
+    <w:nsid w:val="51DA4D25"/>
+    <w:multiLevelType w:val="hybridMultilevel"/>
+    <w:tmpl w:val="B7DAB8EC"/>
+    <w:lvl w:ilvl="0" w:tplc="0809000F">
+      <w:start w:val="1"/>
+      <w:numFmt w:val="decimal"/>
+      <w:lvlText w:val="%1."/>
+      <w:lvlJc w:val="left"/>
+      <w:pPr>
+        <w:ind w:left="720" w:hanging="360"/>
+      </w:pPr>
+    </w:lvl>
+    <w:lvl w:ilvl="1" w:tplc="FFFFFFFF" w:tentative="1">
+      <w:start w:val="1"/>
+      <w:numFmt w:val="lowerLetter"/>
+      <w:lvlText w:val="%2."/>
+      <w:lvlJc w:val="left"/>
+      <w:pPr>
+        <w:ind w:left="1440" w:hanging="360"/>
+      </w:pPr>
+    </w:lvl>
+    <w:lvl w:ilvl="2" w:tplc="FFFFFFFF" w:tentative="1">
+      <w:start w:val="1"/>
+      <w:numFmt w:val="lowerRoman"/>
+      <w:lvlText w:val="%3."/>
+      <w:lvlJc w:val="right"/>
+      <w:pPr>
+        <w:ind w:left="2160" w:hanging="180"/>
+      </w:pPr>
+    </w:lvl>
+    <w:lvl w:ilvl="3" w:tplc="FFFFFFFF" w:tentative="1">
+      <w:start w:val="1"/>
+      <w:numFmt w:val="decimal"/>
+      <w:lvlText w:val="%4."/>
+      <w:lvlJc w:val="left"/>
+      <w:pPr>
+        <w:ind w:left="2880" w:hanging="360"/>
+      </w:pPr>
+    </w:lvl>
+    <w:lvl w:ilvl="4" w:tplc="FFFFFFFF" w:tentative="1">
+      <w:start w:val="1"/>
+      <w:numFmt w:val="lowerLetter"/>
+      <w:lvlText w:val="%5."/>
+      <w:lvlJc w:val="left"/>
+      <w:pPr>
+        <w:ind w:left="3600" w:hanging="360"/>
+      </w:pPr>
+    </w:lvl>
+    <w:lvl w:ilvl="5" w:tplc="FFFFFFFF" w:tentative="1">
+      <w:start w:val="1"/>
+      <w:numFmt w:val="lowerRoman"/>
+      <w:lvlText w:val="%6."/>
+      <w:lvlJc w:val="right"/>
+      <w:pPr>
+        <w:ind w:left="4320" w:hanging="180"/>
+      </w:pPr>
+    </w:lvl>
+    <w:lvl w:ilvl="6" w:tplc="FFFFFFFF" w:tentative="1">
+      <w:start w:val="1"/>
+      <w:numFmt w:val="decimal"/>
+      <w:lvlText w:val="%7."/>
+      <w:lvlJc w:val="left"/>
+      <w:pPr>
+        <w:ind w:left="5040" w:hanging="360"/>
+      </w:pPr>
+    </w:lvl>
+    <w:lvl w:ilvl="7" w:tplc="FFFFFFFF" w:tentative="1">
+      <w:start w:val="1"/>
+      <w:numFmt w:val="lowerLetter"/>
+      <w:lvlText w:val="%8."/>
+      <w:lvlJc w:val="left"/>
+      <w:pPr>
+        <w:ind w:left="5760" w:hanging="360"/>
+      </w:pPr>
+    </w:lvl>
+    <w:lvl w:ilvl="8" w:tplc="FFFFFFFF" w:tentative="1">
+      <w:start w:val="1"/>
+      <w:numFmt w:val="lowerRoman"/>
+      <w:lvlText w:val="%9."/>
+      <w:lvlJc w:val="right"/>
+      <w:pPr>
+        <w:ind w:left="6480" w:hanging="180"/>
+      </w:pPr>
+    </w:lvl>
+  </w:abstractNum>
+  <w:abstractNum w:abstractNumId="9" w15:restartNumberingAfterBreak="0">
     <w:nsid w:val="72600ED2"/>
     <w:multiLevelType w:val="hybridMultilevel"/>
     <w:tmpl w:val="94F26EE2"/>
@@ -4059,7 +4519,7 @@
       </w:pPr>
     </w:lvl>
   </w:abstractNum>
-  <w:abstractNum w:abstractNumId="9" w15:restartNumberingAfterBreak="0">
+  <w:abstractNum w:abstractNumId="10" w15:restartNumberingAfterBreak="0">
     <w:nsid w:val="780535B1"/>
     <w:multiLevelType w:val="hybridMultilevel"/>
     <w:tmpl w:val="A5E49B3C"/>
@@ -4145,7 +4605,7 @@
       </w:pPr>
     </w:lvl>
   </w:abstractNum>
-  <w:abstractNum w:abstractNumId="10" w15:restartNumberingAfterBreak="0">
+  <w:abstractNum w:abstractNumId="11" w15:restartNumberingAfterBreak="0">
     <w:nsid w:val="78C55DC7"/>
     <w:multiLevelType w:val="hybridMultilevel"/>
     <w:tmpl w:val="D74AF3B8"/>
@@ -4283,10 +4743,10 @@
     <w:abstractNumId w:val="1"/>
   </w:num>
   <w:num w:numId="9" w16cid:durableId="1578859057">
-    <w:abstractNumId w:val="8"/>
+    <w:abstractNumId w:val="9"/>
   </w:num>
   <w:num w:numId="10" w16cid:durableId="1736052766">
-    <w:abstractNumId w:val="10"/>
+    <w:abstractNumId w:val="11"/>
   </w:num>
   <w:num w:numId="11" w16cid:durableId="202595889">
     <w:abstractNumId w:val="6"/>
@@ -4301,10 +4761,16 @@
     <w:abstractNumId w:val="4"/>
   </w:num>
   <w:num w:numId="15" w16cid:durableId="2032140677">
-    <w:abstractNumId w:val="9"/>
+    <w:abstractNumId w:val="10"/>
   </w:num>
   <w:num w:numId="16" w16cid:durableId="1581671240">
     <w:abstractNumId w:val="2"/>
+  </w:num>
+  <w:num w:numId="17" w16cid:durableId="977875709">
+    <w:abstractNumId w:val="8"/>
+  </w:num>
+  <w:num w:numId="18" w16cid:durableId="607616550">
+    <w:abstractNumId w:val="0"/>
   </w:num>
 </w:numbering>
 </file>

</xml_diff>

<commit_message>
Updating the Prompts file
</commit_message>
<xml_diff>
--- a/Important Prompts/1_Handwritten_Content_and_Copywritting_Prompts.docx
+++ b/Important Prompts/1_Handwritten_Content_and_Copywritting_Prompts.docx
@@ -3054,21 +3054,132 @@
     </w:p>
     <w:p>
       <w:pPr>
-        <w:rPr>
-          <w:b/>
-          <w:bCs/>
-        </w:rPr>
-      </w:pPr>
-      <w:r>
-        <w:rPr>
-          <w:b/>
-          <w:bCs/>
-        </w:rPr>
+        <w:pStyle w:val="NormalWeb"/>
+        <w:numPr>
+          <w:ilvl w:val="0"/>
+          <w:numId w:val="16"/>
+        </w:numPr>
+      </w:pPr>
+      <w:r>
+        <w:t xml:space="preserve">You just have to give me the content of the slides, </w:t>
+      </w:r>
+      <w:r>
+        <w:t xml:space="preserve">and </w:t>
+      </w:r>
+      <w:r>
+        <w:t xml:space="preserve">I will put this content on </w:t>
+      </w:r>
+      <w:r>
+        <w:t>PowerP</w:t>
+      </w:r>
+      <w:r>
+        <w:t>oint slides and make a presentation.</w:t>
+      </w:r>
+    </w:p>
+    <w:p>
+      <w:pPr>
+        <w:pStyle w:val="NormalWeb"/>
+        <w:numPr>
+          <w:ilvl w:val="0"/>
+          <w:numId w:val="16"/>
+        </w:numPr>
+      </w:pPr>
+      <w:r>
+        <w:t>Design the content for slides in this way</w:t>
+      </w:r>
+      <w:r>
+        <w:t>,</w:t>
+      </w:r>
+      <w:r>
+        <w:t xml:space="preserve"> when I put one slide</w:t>
+      </w:r>
+      <w:r>
+        <w:t>’s</w:t>
+      </w:r>
+      <w:r>
+        <w:t xml:space="preserve"> content on Powe Po</w:t>
+      </w:r>
+      <w:r>
+        <w:t>werPo</w:t>
+      </w:r>
+      <w:r>
+        <w:t>int slide and apply the desi</w:t>
+      </w:r>
+      <w:r>
+        <w:t>gn</w:t>
+      </w:r>
+      <w:r>
+        <w:t xml:space="preserve"> filter, it would look good.</w:t>
+      </w:r>
+    </w:p>
+    <w:p>
+      <w:pPr>
+        <w:pStyle w:val="NormalWeb"/>
+        <w:numPr>
+          <w:ilvl w:val="0"/>
+          <w:numId w:val="16"/>
+        </w:numPr>
+      </w:pPr>
+      <w:r>
+        <w:t xml:space="preserve">The first slide of </w:t>
+      </w:r>
+      <w:r>
+        <w:t xml:space="preserve">the </w:t>
+      </w:r>
+      <w:r>
+        <w:t xml:space="preserve">presentation should include the Topic name and </w:t>
+      </w:r>
+      <w:r>
+        <w:t xml:space="preserve">the </w:t>
+      </w:r>
+      <w:r>
+        <w:t>Author or creator</w:t>
+      </w:r>
+      <w:r>
+        <w:t>’s</w:t>
+      </w:r>
+      <w:r>
+        <w:t xml:space="preserve"> details.</w:t>
+      </w:r>
+    </w:p>
+    <w:p>
+      <w:pPr>
+        <w:rPr>
+          <w:b/>
+          <w:bCs/>
+        </w:rPr>
+      </w:pPr>
+    </w:p>
+    <w:p>
+      <w:pPr>
+        <w:rPr>
+          <w:b/>
+          <w:bCs/>
+        </w:rPr>
+      </w:pPr>
+      <w:r>
+        <w:rPr>
+          <w:b/>
+          <w:bCs/>
+        </w:rPr>
+        <w:lastRenderedPageBreak/>
         <w:t>For Post:</w:t>
       </w:r>
     </w:p>
     <w:p>
       <w:pPr>
+        <w:pStyle w:val="NormalWeb"/>
+        <w:numPr>
+          <w:ilvl w:val="0"/>
+          <w:numId w:val="15"/>
+        </w:numPr>
+      </w:pPr>
+      <w:r>
+        <w:t xml:space="preserve">The post should deflect a sense of joy that I'm happy to share my learning with others. </w:t>
+      </w:r>
+    </w:p>
+    <w:p>
+      <w:pPr>
         <w:pStyle w:val="ListParagraph"/>
         <w:numPr>
           <w:ilvl w:val="0"/>
@@ -3076,13 +3187,13 @@
         </w:numPr>
       </w:pPr>
       <w:r>
-        <w:t>The post should deflect a sense of joy that I’ve completed my course</w:t>
-      </w:r>
-      <w:r>
-        <w:t>/learning</w:t>
-      </w:r>
-      <w:r>
-        <w:t xml:space="preserve"> or achieved another milestone in my career.</w:t>
+        <w:t>The post should tell the objectives of</w:t>
+      </w:r>
+      <w:r>
+        <w:t xml:space="preserve"> my learning</w:t>
+      </w:r>
+      <w:r>
+        <w:t>.</w:t>
       </w:r>
     </w:p>
     <w:p>
@@ -3094,13 +3205,13 @@
         </w:numPr>
       </w:pPr>
       <w:r>
-        <w:t>The post should tell the objectives of</w:t>
-      </w:r>
-      <w:r>
-        <w:t xml:space="preserve"> my learning</w:t>
-      </w:r>
-      <w:r>
-        <w:t>.</w:t>
+        <w:t>The Post should tell why th</w:t>
+      </w:r>
+      <w:r>
+        <w:t>is learning</w:t>
+      </w:r>
+      <w:r>
+        <w:t xml:space="preserve"> is important in my field of interest and how it has helped me to improve my skills.</w:t>
       </w:r>
     </w:p>
     <w:p>
@@ -3112,13 +3223,13 @@
         </w:numPr>
       </w:pPr>
       <w:r>
-        <w:t>The Post should tell why th</w:t>
-      </w:r>
-      <w:r>
-        <w:t>is learning</w:t>
-      </w:r>
-      <w:r>
-        <w:t xml:space="preserve"> is important in my field of interest and how it has helped me to improve my skills.</w:t>
+        <w:t>The post shows relevanc</w:t>
+      </w:r>
+      <w:r>
+        <w:t>e</w:t>
+      </w:r>
+      <w:r>
+        <w:t xml:space="preserve"> to my field of Interest.</w:t>
       </w:r>
     </w:p>
     <w:p>
@@ -3130,14 +3241,292 @@
         </w:numPr>
       </w:pPr>
       <w:r>
+        <w:t xml:space="preserve">The Post should be designed according to </w:t>
+      </w:r>
+      <w:r>
+        <w:t xml:space="preserve">the </w:t>
+      </w:r>
+      <w:r>
+        <w:t>algorithm of LinkedIn (e.g.</w:t>
+      </w:r>
+      <w:r>
+        <w:t>,</w:t>
+      </w:r>
+      <w:r>
+        <w:t xml:space="preserve"> using SEO-based keywords) to get more impressions and views.</w:t>
+      </w:r>
+    </w:p>
+    <w:p>
+      <w:pPr>
+        <w:pStyle w:val="ListParagraph"/>
+        <w:numPr>
+          <w:ilvl w:val="0"/>
+          <w:numId w:val="15"/>
+        </w:numPr>
+      </w:pPr>
+      <w:r>
+        <w:t>The Post should be designed in a way that t</w:t>
+      </w:r>
+      <w:r>
+        <w:t>he LinkedIn algorithm will suggest my post when someone searches for anything related to my field of interest.</w:t>
+      </w:r>
+    </w:p>
+    <w:p>
+      <w:pPr>
+        <w:pStyle w:val="ListParagraph"/>
+        <w:numPr>
+          <w:ilvl w:val="0"/>
+          <w:numId w:val="15"/>
+        </w:numPr>
+      </w:pPr>
+      <w:r>
+        <w:t>The post should be well-defined and well-written.</w:t>
+      </w:r>
+    </w:p>
+    <w:p>
+      <w:pPr>
+        <w:pStyle w:val="ListParagraph"/>
+        <w:numPr>
+          <w:ilvl w:val="0"/>
+          <w:numId w:val="15"/>
+        </w:numPr>
+      </w:pPr>
+      <w:r>
+        <w:t xml:space="preserve">The post should have links for the GitHub repo, </w:t>
+      </w:r>
+      <w:r>
+        <w:t>D</w:t>
+      </w:r>
+      <w:r>
+        <w:t>rive links for documents, etc.</w:t>
+      </w:r>
+    </w:p>
+    <w:p>
+      <w:pPr>
+        <w:rPr>
+          <w:b/>
+          <w:bCs/>
+        </w:rPr>
+      </w:pPr>
+      <w:r>
+        <w:rPr>
+          <w:b/>
+          <w:bCs/>
+        </w:rPr>
+        <w:t>Important topics if any………….</w:t>
+      </w:r>
+    </w:p>
+    <w:p>
+      <w:pPr>
+        <w:rPr>
+          <w:b/>
+          <w:bCs/>
+          <w:lang w:val="en-US"/>
+        </w:rPr>
+      </w:pPr>
+      <w:r>
+        <w:rPr>
+          <w:b/>
+          <w:bCs/>
+          <w:lang w:val="en-US"/>
+        </w:rPr>
+        <w:t>Data:</w:t>
+      </w:r>
+    </w:p>
+    <w:p>
+      <w:pPr>
+        <w:rPr>
+          <w:lang w:val="en-US"/>
+        </w:rPr>
+      </w:pPr>
+      <w:r>
+        <w:rPr>
+          <w:lang w:val="en-US"/>
+        </w:rPr>
+        <w:t>The Data of the course is “    ”</w:t>
+      </w:r>
+    </w:p>
+    <w:p>
+      <w:pPr>
+        <w:pStyle w:val="Heading1"/>
+      </w:pPr>
+      <w:r>
+        <w:t>Prompt to generate a LinkedIn post for your learning in any course/field/topic</w:t>
+      </w:r>
+    </w:p>
+    <w:p>
+      <w:pPr>
+        <w:rPr>
+          <w:b/>
+          <w:bCs/>
+        </w:rPr>
+      </w:pPr>
+      <w:r>
+        <w:rPr>
+          <w:b/>
+          <w:bCs/>
+        </w:rPr>
+        <w:t xml:space="preserve">Upload </w:t>
+      </w:r>
+      <w:r>
+        <w:rPr>
+          <w:b/>
+          <w:bCs/>
+        </w:rPr>
+        <w:t xml:space="preserve">the </w:t>
+      </w:r>
+      <w:r>
+        <w:rPr>
+          <w:b/>
+          <w:bCs/>
+        </w:rPr>
+        <w:t>document of learning:</w:t>
+      </w:r>
+    </w:p>
+    <w:p>
+      <w:pPr>
+        <w:rPr>
+          <w:b/>
+          <w:bCs/>
+          <w:lang w:val="en-US"/>
+        </w:rPr>
+      </w:pPr>
+      <w:r>
+        <w:rPr>
+          <w:b/>
+          <w:bCs/>
+          <w:lang w:val="en-US"/>
+        </w:rPr>
+        <w:t>Context:</w:t>
+      </w:r>
+    </w:p>
+    <w:p>
+      <w:pPr>
+        <w:rPr>
+          <w:lang w:val="en-US"/>
+        </w:rPr>
+      </w:pPr>
+      <w:r>
+        <w:rPr>
+          <w:lang w:val="en-US"/>
+        </w:rPr>
+        <w:t>I am an “aspiring “Data Analyst, Data Scientist, and Passionate AI Engineer”. I have completed my course/research/learning in this “field”. I want to share my course/research/learning on LinkedIn to show my progress in my field of Interest.</w:t>
+      </w:r>
+    </w:p>
+    <w:p>
+      <w:pPr>
+        <w:rPr>
+          <w:b/>
+          <w:bCs/>
+          <w:lang w:val="en-US"/>
+        </w:rPr>
+      </w:pPr>
+      <w:r>
+        <w:rPr>
+          <w:b/>
+          <w:bCs/>
+          <w:lang w:val="en-US"/>
+        </w:rPr>
+        <w:t>Task:</w:t>
+      </w:r>
+    </w:p>
+    <w:p>
+      <w:r>
+        <w:t>I want you to behave like an expert Content Writer, an expert Copywriter specializing in Post writing, and an SEO-based keyword specialist. What you have to do is that I will give you the Data(which gives you information about the course), and utilizing this data, you have to design a LinkedIn post to share my learnings(MS Word OR PDF document) of the topic on LinkedIn according to the instructions given.</w:t>
+      </w:r>
+    </w:p>
+    <w:p>
+      <w:pPr>
+        <w:rPr>
+          <w:b/>
+          <w:bCs/>
+        </w:rPr>
+      </w:pPr>
+      <w:r>
+        <w:rPr>
+          <w:b/>
+          <w:bCs/>
+        </w:rPr>
+        <w:t>Instructions:</w:t>
+      </w:r>
+    </w:p>
+    <w:p>
+      <w:pPr>
+        <w:rPr>
+          <w:b/>
+          <w:bCs/>
+        </w:rPr>
+      </w:pPr>
+      <w:r>
+        <w:rPr>
+          <w:b/>
+          <w:bCs/>
+        </w:rPr>
+        <w:t>For Post:</w:t>
+      </w:r>
+    </w:p>
+    <w:p>
+      <w:pPr>
+        <w:pStyle w:val="ListParagraph"/>
+        <w:numPr>
+          <w:ilvl w:val="0"/>
+          <w:numId w:val="17"/>
+        </w:numPr>
+      </w:pPr>
+      <w:r>
+        <w:t xml:space="preserve">The </w:t>
+      </w:r>
+      <w:r>
+        <w:t xml:space="preserve">start of the </w:t>
+      </w:r>
+      <w:r>
+        <w:t>post should reflect a sense of joy that I</w:t>
+      </w:r>
+      <w:r>
+        <w:t>’m happy to share my learnings or notes</w:t>
+      </w:r>
+      <w:r>
+        <w:t xml:space="preserve"> of the course</w:t>
+      </w:r>
+      <w:r>
+        <w:t xml:space="preserve"> with the people.</w:t>
+      </w:r>
+    </w:p>
+    <w:p>
+      <w:pPr>
+        <w:pStyle w:val="ListParagraph"/>
+        <w:numPr>
+          <w:ilvl w:val="0"/>
+          <w:numId w:val="17"/>
+        </w:numPr>
+      </w:pPr>
+      <w:r>
+        <w:t>The post should tell the objectives of my learning.</w:t>
+      </w:r>
+    </w:p>
+    <w:p>
+      <w:pPr>
+        <w:pStyle w:val="ListParagraph"/>
+        <w:numPr>
+          <w:ilvl w:val="0"/>
+          <w:numId w:val="17"/>
+        </w:numPr>
+      </w:pPr>
+      <w:r>
+        <w:t>The post should tell that I want to share my learning on LinkedIn to help others or to share my knowledge.</w:t>
+      </w:r>
+    </w:p>
+    <w:p>
+      <w:pPr>
+        <w:pStyle w:val="ListParagraph"/>
+        <w:numPr>
+          <w:ilvl w:val="0"/>
+          <w:numId w:val="17"/>
+        </w:numPr>
+      </w:pPr>
+      <w:r>
         <w:lastRenderedPageBreak/>
-        <w:t>The post shows relevanc</w:t>
-      </w:r>
-      <w:r>
-        <w:t>e</w:t>
-      </w:r>
-      <w:r>
-        <w:t xml:space="preserve"> to my field of Interest.</w:t>
+        <w:t>The Post should tell why this learning is important in my field of interest and how it has helped me to improve my skills.</w:t>
       </w:r>
     </w:p>
     <w:p>
@@ -3145,23 +3534,11 @@
         <w:pStyle w:val="ListParagraph"/>
         <w:numPr>
           <w:ilvl w:val="0"/>
-          <w:numId w:val="15"/>
-        </w:numPr>
-      </w:pPr>
-      <w:r>
-        <w:t xml:space="preserve">The Post should be designed according to </w:t>
-      </w:r>
-      <w:r>
-        <w:t xml:space="preserve">the </w:t>
-      </w:r>
-      <w:r>
-        <w:t>algorithm of LinkedIn (e.g.</w:t>
-      </w:r>
-      <w:r>
-        <w:t>,</w:t>
-      </w:r>
-      <w:r>
-        <w:t xml:space="preserve"> using SEO-based keywords) to get more impressions and views.</w:t>
+          <w:numId w:val="17"/>
+        </w:numPr>
+      </w:pPr>
+      <w:r>
+        <w:t>The post shows relevance to my field of Interest.</w:t>
       </w:r>
     </w:p>
     <w:p>
@@ -3169,14 +3546,11 @@
         <w:pStyle w:val="ListParagraph"/>
         <w:numPr>
           <w:ilvl w:val="0"/>
-          <w:numId w:val="15"/>
-        </w:numPr>
-      </w:pPr>
-      <w:r>
-        <w:t>The Post should be designed in a way that t</w:t>
-      </w:r>
-      <w:r>
-        <w:t>he LinkedIn algorithm will suggest my post when someone searches for anything related to my field of interest.</w:t>
+          <w:numId w:val="17"/>
+        </w:numPr>
+      </w:pPr>
+      <w:r>
+        <w:t>The Post should be designed according to the algorithm of LinkedIn (e.g., using SEO-based keywords) to get more impressions and views.</w:t>
       </w:r>
     </w:p>
     <w:p>
@@ -3184,292 +3558,10 @@
         <w:pStyle w:val="ListParagraph"/>
         <w:numPr>
           <w:ilvl w:val="0"/>
-          <w:numId w:val="15"/>
-        </w:numPr>
-      </w:pPr>
-      <w:r>
-        <w:t>The post should be well-defined and well-written.</w:t>
-      </w:r>
-    </w:p>
-    <w:p>
-      <w:pPr>
-        <w:pStyle w:val="ListParagraph"/>
-        <w:numPr>
-          <w:ilvl w:val="0"/>
-          <w:numId w:val="15"/>
-        </w:numPr>
-      </w:pPr>
-      <w:r>
-        <w:t xml:space="preserve">The post should have links for the GitHub repo, </w:t>
-      </w:r>
-      <w:r>
-        <w:t>D</w:t>
-      </w:r>
-      <w:r>
-        <w:t>rive links for documents, etc.</w:t>
-      </w:r>
-    </w:p>
-    <w:p>
-      <w:pPr>
-        <w:rPr>
-          <w:b/>
-          <w:bCs/>
-        </w:rPr>
-      </w:pPr>
-      <w:r>
-        <w:rPr>
-          <w:b/>
-          <w:bCs/>
-        </w:rPr>
-        <w:t>Important topics if any………….</w:t>
-      </w:r>
-    </w:p>
-    <w:p>
-      <w:pPr>
-        <w:rPr>
-          <w:b/>
-          <w:bCs/>
-          <w:lang w:val="en-US"/>
-        </w:rPr>
-      </w:pPr>
-      <w:r>
-        <w:rPr>
-          <w:b/>
-          <w:bCs/>
-          <w:lang w:val="en-US"/>
-        </w:rPr>
-        <w:t>Data:</w:t>
-      </w:r>
-    </w:p>
-    <w:p>
-      <w:pPr>
-        <w:rPr>
-          <w:lang w:val="en-US"/>
-        </w:rPr>
-      </w:pPr>
-      <w:r>
-        <w:rPr>
-          <w:lang w:val="en-US"/>
-        </w:rPr>
-        <w:t>The Data of the course is “    ”</w:t>
-      </w:r>
-    </w:p>
-    <w:p>
-      <w:pPr>
-        <w:pStyle w:val="Heading1"/>
-      </w:pPr>
-      <w:r>
-        <w:t>Prompt to generate a LinkedIn post for your learning in any course/field/topic</w:t>
-      </w:r>
-    </w:p>
-    <w:p>
-      <w:pPr>
-        <w:rPr>
-          <w:b/>
-          <w:bCs/>
-        </w:rPr>
-      </w:pPr>
-      <w:r>
-        <w:rPr>
-          <w:b/>
-          <w:bCs/>
-        </w:rPr>
-        <w:t xml:space="preserve">Upload </w:t>
-      </w:r>
-      <w:r>
-        <w:rPr>
-          <w:b/>
-          <w:bCs/>
-        </w:rPr>
-        <w:t xml:space="preserve">the </w:t>
-      </w:r>
-      <w:r>
-        <w:rPr>
-          <w:b/>
-          <w:bCs/>
-        </w:rPr>
-        <w:t>document of learning:</w:t>
-      </w:r>
-    </w:p>
-    <w:p>
-      <w:pPr>
-        <w:rPr>
-          <w:b/>
-          <w:bCs/>
-          <w:lang w:val="en-US"/>
-        </w:rPr>
-      </w:pPr>
-      <w:r>
-        <w:rPr>
-          <w:b/>
-          <w:bCs/>
-          <w:lang w:val="en-US"/>
-        </w:rPr>
-        <w:t>Context:</w:t>
-      </w:r>
-    </w:p>
-    <w:p>
-      <w:pPr>
-        <w:rPr>
-          <w:lang w:val="en-US"/>
-        </w:rPr>
-      </w:pPr>
-      <w:r>
-        <w:rPr>
-          <w:lang w:val="en-US"/>
-        </w:rPr>
-        <w:t>I am an “aspiring “Data Analyst, Data Scientist, and Passionate AI Engineer”. I have completed my course/research/learning in this “field”. I want to share my course/research/learning on LinkedIn to show my progress in my field of Interest.</w:t>
-      </w:r>
-    </w:p>
-    <w:p>
-      <w:pPr>
-        <w:rPr>
-          <w:b/>
-          <w:bCs/>
-          <w:lang w:val="en-US"/>
-        </w:rPr>
-      </w:pPr>
-      <w:r>
-        <w:rPr>
-          <w:b/>
-          <w:bCs/>
-          <w:lang w:val="en-US"/>
-        </w:rPr>
-        <w:t>Task:</w:t>
-      </w:r>
-    </w:p>
-    <w:p>
-      <w:r>
-        <w:t>I want you to behave like an expert Content Writer, an expert Copywriter specializing in Post writing, and an SEO-based keyword specialist. What you have to do is that I will give you the Data(which gives you information about the course), and utilizing this data, you have to design a LinkedIn post to share my learnings(MS Word OR PDF document) of the topic on LinkedIn according to the instructions given.</w:t>
-      </w:r>
-    </w:p>
-    <w:p>
-      <w:pPr>
-        <w:rPr>
-          <w:b/>
-          <w:bCs/>
-        </w:rPr>
-      </w:pPr>
-      <w:r>
-        <w:rPr>
-          <w:b/>
-          <w:bCs/>
-        </w:rPr>
-        <w:t>Instructions:</w:t>
-      </w:r>
-    </w:p>
-    <w:p>
-      <w:pPr>
-        <w:rPr>
-          <w:b/>
-          <w:bCs/>
-        </w:rPr>
-      </w:pPr>
-      <w:r>
-        <w:rPr>
-          <w:b/>
-          <w:bCs/>
-        </w:rPr>
-        <w:t>For Post:</w:t>
-      </w:r>
-    </w:p>
-    <w:p>
-      <w:pPr>
-        <w:pStyle w:val="ListParagraph"/>
-        <w:numPr>
-          <w:ilvl w:val="0"/>
           <w:numId w:val="17"/>
         </w:numPr>
       </w:pPr>
       <w:r>
-        <w:t xml:space="preserve">The </w:t>
-      </w:r>
-      <w:r>
-        <w:t xml:space="preserve">start of the </w:t>
-      </w:r>
-      <w:r>
-        <w:t>post should reflect a sense of joy that I</w:t>
-      </w:r>
-      <w:r>
-        <w:t>’m happy to share my learnings or notes</w:t>
-      </w:r>
-      <w:r>
-        <w:t xml:space="preserve"> of the course</w:t>
-      </w:r>
-      <w:r>
-        <w:t xml:space="preserve"> with the people.</w:t>
-      </w:r>
-    </w:p>
-    <w:p>
-      <w:pPr>
-        <w:pStyle w:val="ListParagraph"/>
-        <w:numPr>
-          <w:ilvl w:val="0"/>
-          <w:numId w:val="17"/>
-        </w:numPr>
-      </w:pPr>
-      <w:r>
-        <w:t>The post should tell the objectives of my learning.</w:t>
-      </w:r>
-    </w:p>
-    <w:p>
-      <w:pPr>
-        <w:pStyle w:val="ListParagraph"/>
-        <w:numPr>
-          <w:ilvl w:val="0"/>
-          <w:numId w:val="17"/>
-        </w:numPr>
-      </w:pPr>
-      <w:r>
-        <w:t>The post should tell that I want to share my learning on LinkedIn to help others or to share my knowledge.</w:t>
-      </w:r>
-    </w:p>
-    <w:p>
-      <w:pPr>
-        <w:pStyle w:val="ListParagraph"/>
-        <w:numPr>
-          <w:ilvl w:val="0"/>
-          <w:numId w:val="17"/>
-        </w:numPr>
-      </w:pPr>
-      <w:r>
-        <w:t>The Post should tell why this learning is important in my field of interest and how it has helped me to improve my skills.</w:t>
-      </w:r>
-    </w:p>
-    <w:p>
-      <w:pPr>
-        <w:pStyle w:val="ListParagraph"/>
-        <w:numPr>
-          <w:ilvl w:val="0"/>
-          <w:numId w:val="17"/>
-        </w:numPr>
-      </w:pPr>
-      <w:r>
-        <w:t>The post shows relevance to my field of Interest.</w:t>
-      </w:r>
-    </w:p>
-    <w:p>
-      <w:pPr>
-        <w:pStyle w:val="ListParagraph"/>
-        <w:numPr>
-          <w:ilvl w:val="0"/>
-          <w:numId w:val="17"/>
-        </w:numPr>
-      </w:pPr>
-      <w:r>
-        <w:t>The Post should be designed according to the algorithm of LinkedIn (e.g., using SEO-based keywords) to get more impressions and views.</w:t>
-      </w:r>
-    </w:p>
-    <w:p>
-      <w:pPr>
-        <w:pStyle w:val="ListParagraph"/>
-        <w:numPr>
-          <w:ilvl w:val="0"/>
-          <w:numId w:val="17"/>
-        </w:numPr>
-      </w:pPr>
-      <w:r>
-        <w:lastRenderedPageBreak/>
         <w:t>The Post should be designed in a way that the LinkedIn algorithm will suggest my post when someone searches for anything related to my field of interest.</w:t>
       </w:r>
     </w:p>
@@ -5740,7 +5832,6 @@
     <w:name w:val="Normal (Web)"/>
     <w:basedOn w:val="Normal"/>
     <w:uiPriority w:val="99"/>
-    <w:semiHidden/>
     <w:unhideWhenUsed/>
     <w:rsid w:val="0015780C"/>
     <w:pPr>

</xml_diff>

<commit_message>
Update Content Formatting Prompt
</commit_message>
<xml_diff>
--- a/Important Prompts/1_Handwritten_Content_and_Copywritting_Prompts.docx
+++ b/Important Prompts/1_Handwritten_Content_and_Copywritting_Prompts.docx
@@ -2388,7 +2388,7 @@
         <w:jc w:val="both"/>
       </w:pPr>
       <w:r>
-        <w:t xml:space="preserve">“After reading this, it should not look like this topic is the formatted version of a video transcript, so avoid the words like ‘In this video or transcript’ and use ‘In this topic’, etc. </w:t>
+        <w:t xml:space="preserve">“After reading this, it should not look like this topic is the formatted version of a video transcript, so avoid words like ‘In this video or transcript’ and use ‘In this topic’, etc. </w:t>
       </w:r>
     </w:p>
     <w:p>
@@ -2402,6 +2402,74 @@
       </w:pPr>
       <w:r>
         <w:t>Give me the formatted content in the writing block where I can edit or copy the content via a simple copy button.</w:t>
+      </w:r>
+    </w:p>
+    <w:p>
+      <w:pPr>
+        <w:pStyle w:val="NormalWeb"/>
+        <w:numPr>
+          <w:ilvl w:val="0"/>
+          <w:numId w:val="19"/>
+        </w:numPr>
+        <w:jc w:val="both"/>
+      </w:pPr>
+      <w:r>
+        <w:t xml:space="preserve">Give me formatted content in one writing block. </w:t>
+      </w:r>
+    </w:p>
+    <w:p>
+      <w:pPr>
+        <w:pStyle w:val="NormalWeb"/>
+        <w:numPr>
+          <w:ilvl w:val="0"/>
+          <w:numId w:val="19"/>
+        </w:numPr>
+        <w:jc w:val="both"/>
+      </w:pPr>
+      <w:r>
+        <w:t xml:space="preserve">Use "we" instead of "I" to engage with the user or reader. </w:t>
+      </w:r>
+    </w:p>
+    <w:p>
+      <w:pPr>
+        <w:pStyle w:val="NormalWeb"/>
+        <w:numPr>
+          <w:ilvl w:val="0"/>
+          <w:numId w:val="19"/>
+        </w:numPr>
+        <w:jc w:val="both"/>
+      </w:pPr>
+      <w:r>
+        <w:t>If there are links in the provided content, add them to in the formatted content.</w:t>
+      </w:r>
+    </w:p>
+    <w:p>
+      <w:pPr>
+        <w:pStyle w:val="NormalWeb"/>
+        <w:numPr>
+          <w:ilvl w:val="0"/>
+          <w:numId w:val="19"/>
+        </w:numPr>
+        <w:jc w:val="both"/>
+      </w:pPr>
+      <w:r>
+        <w:t>Don't try to rephrase the facts told in the content that I will provide you to formatize it. Add the facts, figures, and any kind of quantitative data in the formatted version of the content as included in the video transcription or content that I will provide you. For example, if the video transcription or provided content has " 200 goats inside the farm," you don't try to rephrase it into hundreds of goats inside the farm".</w:t>
+      </w:r>
+    </w:p>
+    <w:p>
+      <w:pPr>
+        <w:pStyle w:val="NormalWeb"/>
+        <w:numPr>
+          <w:ilvl w:val="0"/>
+          <w:numId w:val="19"/>
+        </w:numPr>
+        <w:jc w:val="both"/>
+      </w:pPr>
+      <w:r>
+        <w:t>Do not omit any named person, organization, or specific real-world example mentioned</w:t>
+      </w:r>
+      <w:r>
+        <w:t>.</w:t>
       </w:r>
     </w:p>
     <w:p>
@@ -2472,6 +2540,7 @@
           <w:rFonts w:asciiTheme="majorBidi" w:hAnsiTheme="majorBidi" w:cstheme="majorBidi"/>
           <w:lang w:val="en-US"/>
         </w:rPr>
+        <w:lastRenderedPageBreak/>
         <w:t>I am an “aspiring “Data Analyst, Data Scientist, and Passionate AI Engineer. I have completed my course from Coursera, named "Tools for Data Science.” I want to share my course certificate on LinkedIn to show my progress in my field of Interest.</w:t>
       </w:r>
     </w:p>
@@ -2540,14 +2609,7 @@
         <w:rPr>
           <w:rFonts w:asciiTheme="majorBidi" w:hAnsiTheme="majorBidi" w:cstheme="majorBidi"/>
         </w:rPr>
-        <w:t xml:space="preserve">based keyword specialist. What you have to do is that I will give you the </w:t>
-      </w:r>
-      <w:r>
-        <w:rPr>
-          <w:rFonts w:asciiTheme="majorBidi" w:hAnsiTheme="majorBidi" w:cstheme="majorBidi"/>
-        </w:rPr>
-        <w:lastRenderedPageBreak/>
-        <w:t xml:space="preserve">Data(of my course), and </w:t>
+        <w:t xml:space="preserve">based keyword specialist. What you have to do is that I will give you the Data(of my course), and </w:t>
       </w:r>
       <w:r>
         <w:rPr>
@@ -3339,6 +3401,7 @@
           <w:b/>
           <w:bCs/>
         </w:rPr>
+        <w:lastRenderedPageBreak/>
         <w:t>Instructions:</w:t>
       </w:r>
     </w:p>
@@ -3492,7 +3555,6 @@
         <w:rPr>
           <w:rFonts w:asciiTheme="majorBidi" w:hAnsiTheme="majorBidi" w:cstheme="majorBidi"/>
         </w:rPr>
-        <w:lastRenderedPageBreak/>
         <w:t xml:space="preserve">I should </w:t>
       </w:r>
       <w:r>
@@ -4005,6 +4067,7 @@
           <w:bCs/>
           <w:lang w:val="en-US"/>
         </w:rPr>
+        <w:lastRenderedPageBreak/>
         <w:t>Context:</w:t>
       </w:r>
     </w:p>
@@ -4052,7 +4115,6 @@
         <w:rPr>
           <w:rFonts w:asciiTheme="majorBidi" w:hAnsiTheme="majorBidi" w:cstheme="majorBidi"/>
         </w:rPr>
-        <w:lastRenderedPageBreak/>
         <w:t>I want you to behave like an expert Content Writer, an expert Copywriter specializing in Post writing, and an SEO-based keyword specialist. What you have to do is that I will give you the Data(which gives you information about the course), and utilizing this data, you have to design a LinkedIn post to share my learnings(MS Word OR PDF document) of the topic on LinkedIn according to the instructions given.</w:t>
       </w:r>
     </w:p>
@@ -4410,6 +4472,7 @@
         <w:rPr>
           <w:rFonts w:asciiTheme="majorBidi" w:hAnsiTheme="majorBidi" w:cstheme="majorBidi"/>
         </w:rPr>
+        <w:lastRenderedPageBreak/>
         <w:t xml:space="preserve">1. Heading style according to the Number of Topics and their heading types(heading 1, heading 2, heading 3), but now the heading number should start from heading 4. </w:t>
       </w:r>
     </w:p>
@@ -4462,7 +4525,6 @@
         <w:rPr>
           <w:rFonts w:asciiTheme="majorBidi" w:hAnsiTheme="majorBidi" w:cstheme="majorBidi"/>
         </w:rPr>
-        <w:lastRenderedPageBreak/>
         <w:t xml:space="preserve">Content:" </w:t>
       </w:r>
     </w:p>

</xml_diff>

<commit_message>
Adding new Prompt of Lab's file analsis for content extraction
</commit_message>
<xml_diff>
--- a/Important Prompts/1_Handwritten_Content_and_Copywritting_Prompts.docx
+++ b/Important Prompts/1_Handwritten_Content_and_Copywritting_Prompts.docx
@@ -2466,10 +2466,7 @@
         <w:jc w:val="both"/>
       </w:pPr>
       <w:r>
-        <w:t>Do not omit any named person, organization, or specific real-world example mentioned</w:t>
-      </w:r>
-      <w:r>
-        <w:t>.</w:t>
+        <w:t>Do not omit any named person, organization, or specific real-world example mentioned.</w:t>
       </w:r>
     </w:p>
     <w:p>
@@ -4532,15 +4529,1595 @@
       <w:pPr>
         <w:rPr>
           <w:rFonts w:asciiTheme="majorBidi" w:hAnsiTheme="majorBidi" w:cstheme="majorBidi"/>
+        </w:rPr>
+      </w:pPr>
+      <w:r>
+        <w:rPr>
+          <w:rFonts w:asciiTheme="majorBidi" w:hAnsiTheme="majorBidi" w:cstheme="majorBidi"/>
+        </w:rPr>
+        <w:t>".</w:t>
+      </w:r>
+    </w:p>
+    <w:p>
+      <w:pPr>
+        <w:rPr>
+          <w:rFonts w:asciiTheme="majorBidi" w:hAnsiTheme="majorBidi" w:cstheme="majorBidi"/>
+        </w:rPr>
+      </w:pPr>
+    </w:p>
+    <w:p>
+      <w:pPr>
+        <w:rPr>
+          <w:rFonts w:asciiTheme="majorBidi" w:hAnsiTheme="majorBidi" w:cstheme="majorBidi"/>
           <w:lang w:val="en-US"/>
         </w:rPr>
       </w:pPr>
-      <w:r>
-        <w:rPr>
-          <w:rFonts w:asciiTheme="majorBidi" w:hAnsiTheme="majorBidi" w:cstheme="majorBidi"/>
-        </w:rPr>
-        <w:t>".</w:t>
-      </w:r>
+    </w:p>
+    <w:p>
+      <w:pPr>
+        <w:pStyle w:val="Heading1"/>
+      </w:pPr>
+      <w:r>
+        <w:t>Master Prompt for Extracting Important Content from Lab README.md/PDF Files</w:t>
+      </w:r>
+    </w:p>
+    <w:p>
+      <w:pPr>
+        <w:pStyle w:val="Heading2"/>
+        <w:numPr>
+          <w:ilvl w:val="0"/>
+          <w:numId w:val="0"/>
+        </w:numPr>
+        <w:ind w:left="576" w:hanging="576"/>
+      </w:pPr>
+      <w:r>
+        <w:t>Role</w:t>
+      </w:r>
+    </w:p>
+    <w:p>
+      <w:pPr>
+        <w:pStyle w:val="NormalWeb"/>
+      </w:pPr>
+      <w:r>
+        <w:t>You are an expert technical content editor and documentation specialist.</w:t>
+      </w:r>
+    </w:p>
+    <w:p>
+      <w:pPr>
+        <w:pStyle w:val="NormalWeb"/>
+      </w:pPr>
+      <w:r>
+        <w:t xml:space="preserve">Your task is to analyze the provided </w:t>
+      </w:r>
+      <w:r>
+        <w:rPr>
+          <w:rStyle w:val="Strong"/>
+          <w:rFonts w:eastAsiaTheme="majorEastAsia"/>
+        </w:rPr>
+        <w:t>README.md</w:t>
+      </w:r>
+      <w:r>
+        <w:t xml:space="preserve"> file or </w:t>
+      </w:r>
+      <w:r>
+        <w:rPr>
+          <w:rStyle w:val="Strong"/>
+          <w:rFonts w:eastAsiaTheme="majorEastAsia"/>
+        </w:rPr>
+        <w:t>PDF</w:t>
+      </w:r>
+      <w:r>
+        <w:t xml:space="preserve"> of a course exercise and extract only the information that is valuable for long-term study notes.</w:t>
+      </w:r>
+    </w:p>
+    <w:p>
+      <w:pPr>
+        <w:pStyle w:val="NormalWeb"/>
+      </w:pPr>
+      <w:r>
+        <w:t xml:space="preserve">The goal is </w:t>
+      </w:r>
+      <w:r>
+        <w:rPr>
+          <w:rStyle w:val="Strong"/>
+          <w:rFonts w:eastAsiaTheme="majorEastAsia"/>
+        </w:rPr>
+        <w:t>NOT</w:t>
+      </w:r>
+      <w:r>
+        <w:t xml:space="preserve"> to summarize the document. Instead, convert the exercise into well-structured study notes that can be merged with theory notes.</w:t>
+      </w:r>
+    </w:p>
+    <w:p>
+      <w:pPr>
+        <w:pStyle w:val="Heading1"/>
+        <w:numPr>
+          <w:ilvl w:val="0"/>
+          <w:numId w:val="0"/>
+        </w:numPr>
+        <w:ind w:left="432" w:hanging="432"/>
+      </w:pPr>
+      <w:r>
+        <w:t>Primary Objective</w:t>
+      </w:r>
+    </w:p>
+    <w:p>
+      <w:pPr>
+        <w:pStyle w:val="NormalWeb"/>
+      </w:pPr>
+      <w:r>
+        <w:t>Create clean, concise, and well-organized notes that explain the concepts, prompts, objectives, and important information demonstrated in the exercise.</w:t>
+      </w:r>
+    </w:p>
+    <w:p>
+      <w:pPr>
+        <w:pStyle w:val="NormalWeb"/>
+      </w:pPr>
+      <w:r>
+        <w:t>Remove everything that is procedural, repetitive, or unnecessary for revision.</w:t>
+      </w:r>
+    </w:p>
+    <w:p>
+      <w:pPr>
+        <w:pStyle w:val="NormalWeb"/>
+      </w:pPr>
+      <w:r>
+        <w:t>The final output should read like professional course notes rather than exercise instructions.</w:t>
+      </w:r>
+    </w:p>
+    <w:p>
+      <w:pPr>
+        <w:pStyle w:val="Heading1"/>
+        <w:numPr>
+          <w:ilvl w:val="0"/>
+          <w:numId w:val="0"/>
+        </w:numPr>
+        <w:ind w:left="432" w:hanging="432"/>
+      </w:pPr>
+      <w:r>
+        <w:t>General Rules</w:t>
+      </w:r>
+    </w:p>
+    <w:p>
+      <w:pPr>
+        <w:pStyle w:val="Heading2"/>
+        <w:numPr>
+          <w:ilvl w:val="0"/>
+          <w:numId w:val="0"/>
+        </w:numPr>
+        <w:ind w:left="576" w:hanging="576"/>
+      </w:pPr>
+      <w:r>
+        <w:t>Keep</w:t>
+      </w:r>
+    </w:p>
+    <w:p>
+      <w:pPr>
+        <w:pStyle w:val="NormalWeb"/>
+      </w:pPr>
+      <w:r>
+        <w:t>Include only the following:</w:t>
+      </w:r>
+    </w:p>
+    <w:p>
+      <w:pPr>
+        <w:pStyle w:val="NormalWeb"/>
+        <w:numPr>
+          <w:ilvl w:val="0"/>
+          <w:numId w:val="20"/>
+        </w:numPr>
+      </w:pPr>
+      <w:r>
+        <w:t>Main title</w:t>
+      </w:r>
+    </w:p>
+    <w:p>
+      <w:pPr>
+        <w:pStyle w:val="NormalWeb"/>
+        <w:numPr>
+          <w:ilvl w:val="0"/>
+          <w:numId w:val="20"/>
+        </w:numPr>
+      </w:pPr>
+      <w:r>
+        <w:t>Learning Objectives</w:t>
+      </w:r>
+    </w:p>
+    <w:p>
+      <w:pPr>
+        <w:pStyle w:val="NormalWeb"/>
+        <w:numPr>
+          <w:ilvl w:val="0"/>
+          <w:numId w:val="20"/>
+        </w:numPr>
+      </w:pPr>
+      <w:r>
+        <w:t>Brief Introduction</w:t>
+      </w:r>
+    </w:p>
+    <w:p>
+      <w:pPr>
+        <w:pStyle w:val="NormalWeb"/>
+        <w:numPr>
+          <w:ilvl w:val="0"/>
+          <w:numId w:val="20"/>
+        </w:numPr>
+      </w:pPr>
+      <w:r>
+        <w:t>Exercise titles</w:t>
+      </w:r>
+    </w:p>
+    <w:p>
+      <w:pPr>
+        <w:pStyle w:val="NormalWeb"/>
+        <w:numPr>
+          <w:ilvl w:val="0"/>
+          <w:numId w:val="20"/>
+        </w:numPr>
+      </w:pPr>
+      <w:r>
+        <w:t>Purpose of each exercise</w:t>
+      </w:r>
+    </w:p>
+    <w:p>
+      <w:pPr>
+        <w:pStyle w:val="NormalWeb"/>
+        <w:numPr>
+          <w:ilvl w:val="0"/>
+          <w:numId w:val="20"/>
+        </w:numPr>
+      </w:pPr>
+      <w:r>
+        <w:t>Important prompts</w:t>
+      </w:r>
+    </w:p>
+    <w:p>
+      <w:pPr>
+        <w:pStyle w:val="NormalWeb"/>
+        <w:numPr>
+          <w:ilvl w:val="0"/>
+          <w:numId w:val="20"/>
+        </w:numPr>
+      </w:pPr>
+      <w:r>
+        <w:lastRenderedPageBreak/>
+        <w:t>Important commands (if any)</w:t>
+      </w:r>
+    </w:p>
+    <w:p>
+      <w:pPr>
+        <w:pStyle w:val="NormalWeb"/>
+        <w:numPr>
+          <w:ilvl w:val="0"/>
+          <w:numId w:val="20"/>
+        </w:numPr>
+      </w:pPr>
+      <w:r>
+        <w:t>Important code snippets (if any)</w:t>
+      </w:r>
+    </w:p>
+    <w:p>
+      <w:pPr>
+        <w:pStyle w:val="NormalWeb"/>
+        <w:numPr>
+          <w:ilvl w:val="0"/>
+          <w:numId w:val="20"/>
+        </w:numPr>
+      </w:pPr>
+      <w:r>
+        <w:t>Important concepts</w:t>
+      </w:r>
+    </w:p>
+    <w:p>
+      <w:pPr>
+        <w:pStyle w:val="NormalWeb"/>
+        <w:numPr>
+          <w:ilvl w:val="0"/>
+          <w:numId w:val="20"/>
+        </w:numPr>
+      </w:pPr>
+      <w:r>
+        <w:t>Important explanations</w:t>
+      </w:r>
+    </w:p>
+    <w:p>
+      <w:pPr>
+        <w:pStyle w:val="NormalWeb"/>
+        <w:numPr>
+          <w:ilvl w:val="0"/>
+          <w:numId w:val="20"/>
+        </w:numPr>
+      </w:pPr>
+      <w:r>
+        <w:t>Important observations</w:t>
+      </w:r>
+    </w:p>
+    <w:p>
+      <w:pPr>
+        <w:pStyle w:val="NormalWeb"/>
+        <w:numPr>
+          <w:ilvl w:val="0"/>
+          <w:numId w:val="20"/>
+        </w:numPr>
+      </w:pPr>
+      <w:r>
+        <w:t>Important ethical considerations</w:t>
+      </w:r>
+    </w:p>
+    <w:p>
+      <w:pPr>
+        <w:pStyle w:val="NormalWeb"/>
+        <w:numPr>
+          <w:ilvl w:val="0"/>
+          <w:numId w:val="20"/>
+        </w:numPr>
+      </w:pPr>
+      <w:r>
+        <w:t>Important best practices</w:t>
+      </w:r>
+    </w:p>
+    <w:p>
+      <w:pPr>
+        <w:pStyle w:val="NormalWeb"/>
+        <w:numPr>
+          <w:ilvl w:val="0"/>
+          <w:numId w:val="20"/>
+        </w:numPr>
+      </w:pPr>
+      <w:r>
+        <w:t>Summary</w:t>
+      </w:r>
+    </w:p>
+    <w:p>
+      <w:pPr>
+        <w:pStyle w:val="Heading2"/>
+        <w:numPr>
+          <w:ilvl w:val="0"/>
+          <w:numId w:val="0"/>
+        </w:numPr>
+        <w:ind w:left="576" w:hanging="576"/>
+      </w:pPr>
+      <w:r>
+        <w:t>Remove Completely</w:t>
+      </w:r>
+    </w:p>
+    <w:p>
+      <w:pPr>
+        <w:pStyle w:val="NormalWeb"/>
+      </w:pPr>
+      <w:r>
+        <w:t>Do NOT include:</w:t>
+      </w:r>
+    </w:p>
+    <w:p>
+      <w:pPr>
+        <w:pStyle w:val="NormalWeb"/>
+        <w:numPr>
+          <w:ilvl w:val="0"/>
+          <w:numId w:val="21"/>
+        </w:numPr>
+      </w:pPr>
+      <w:r>
+        <w:t>Estimated time</w:t>
+      </w:r>
+    </w:p>
+    <w:p>
+      <w:pPr>
+        <w:pStyle w:val="NormalWeb"/>
+        <w:numPr>
+          <w:ilvl w:val="0"/>
+          <w:numId w:val="21"/>
+        </w:numPr>
+      </w:pPr>
+      <w:r>
+        <w:t>Login instructions</w:t>
+      </w:r>
+    </w:p>
+    <w:p>
+      <w:pPr>
+        <w:pStyle w:val="NormalWeb"/>
+        <w:numPr>
+          <w:ilvl w:val="0"/>
+          <w:numId w:val="21"/>
+        </w:numPr>
+      </w:pPr>
+      <w:r>
+        <w:t>Account creation</w:t>
+      </w:r>
+    </w:p>
+    <w:p>
+      <w:pPr>
+        <w:pStyle w:val="NormalWeb"/>
+        <w:numPr>
+          <w:ilvl w:val="0"/>
+          <w:numId w:val="21"/>
+        </w:numPr>
+      </w:pPr>
+      <w:r>
+        <w:t>Sign up instructions</w:t>
+      </w:r>
+    </w:p>
+    <w:p>
+      <w:pPr>
+        <w:pStyle w:val="NormalWeb"/>
+        <w:numPr>
+          <w:ilvl w:val="0"/>
+          <w:numId w:val="21"/>
+        </w:numPr>
+      </w:pPr>
+      <w:r>
+        <w:t>Opening websites</w:t>
+      </w:r>
+    </w:p>
+    <w:p>
+      <w:pPr>
+        <w:pStyle w:val="NormalWeb"/>
+        <w:numPr>
+          <w:ilvl w:val="0"/>
+          <w:numId w:val="21"/>
+        </w:numPr>
+      </w:pPr>
+      <w:r>
+        <w:t>Clicking buttons</w:t>
+      </w:r>
+    </w:p>
+    <w:p>
+      <w:pPr>
+        <w:pStyle w:val="NormalWeb"/>
+        <w:numPr>
+          <w:ilvl w:val="0"/>
+          <w:numId w:val="21"/>
+        </w:numPr>
+      </w:pPr>
+      <w:r>
+        <w:t>Interface screenshots</w:t>
+      </w:r>
+    </w:p>
+    <w:p>
+      <w:pPr>
+        <w:pStyle w:val="NormalWeb"/>
+        <w:numPr>
+          <w:ilvl w:val="0"/>
+          <w:numId w:val="21"/>
+        </w:numPr>
+      </w:pPr>
+      <w:r>
+        <w:t>Images</w:t>
+      </w:r>
+    </w:p>
+    <w:p>
+      <w:pPr>
+        <w:pStyle w:val="NormalWeb"/>
+        <w:numPr>
+          <w:ilvl w:val="0"/>
+          <w:numId w:val="21"/>
+        </w:numPr>
+      </w:pPr>
+      <w:r>
+        <w:t>Figure references</w:t>
+      </w:r>
+    </w:p>
+    <w:p>
+      <w:pPr>
+        <w:pStyle w:val="NormalWeb"/>
+        <w:numPr>
+          <w:ilvl w:val="0"/>
+          <w:numId w:val="21"/>
+        </w:numPr>
+      </w:pPr>
+      <w:r>
+        <w:t>Browser instructions</w:t>
+      </w:r>
+    </w:p>
+    <w:p>
+      <w:pPr>
+        <w:pStyle w:val="NormalWeb"/>
+        <w:numPr>
+          <w:ilvl w:val="0"/>
+          <w:numId w:val="21"/>
+        </w:numPr>
+      </w:pPr>
+      <w:r>
+        <w:t>Notes about different model versions</w:t>
+      </w:r>
+    </w:p>
+    <w:p>
+      <w:pPr>
+        <w:pStyle w:val="NormalWeb"/>
+        <w:numPr>
+          <w:ilvl w:val="0"/>
+          <w:numId w:val="21"/>
+        </w:numPr>
+      </w:pPr>
+      <w:r>
+        <w:t>Copyright</w:t>
+      </w:r>
+    </w:p>
+    <w:p>
+      <w:pPr>
+        <w:pStyle w:val="NormalWeb"/>
+        <w:numPr>
+          <w:ilvl w:val="0"/>
+          <w:numId w:val="21"/>
+        </w:numPr>
+      </w:pPr>
+      <w:r>
+        <w:t>Authors</w:t>
+      </w:r>
+    </w:p>
+    <w:p>
+      <w:pPr>
+        <w:pStyle w:val="NormalWeb"/>
+        <w:numPr>
+          <w:ilvl w:val="0"/>
+          <w:numId w:val="21"/>
+        </w:numPr>
+      </w:pPr>
+      <w:r>
+        <w:t>Changelog</w:t>
+      </w:r>
+    </w:p>
+    <w:p>
+      <w:pPr>
+        <w:pStyle w:val="NormalWeb"/>
+        <w:numPr>
+          <w:ilvl w:val="0"/>
+          <w:numId w:val="21"/>
+        </w:numPr>
+      </w:pPr>
+      <w:r>
+        <w:t>Congratulations messages</w:t>
+      </w:r>
+    </w:p>
+    <w:p>
+      <w:pPr>
+        <w:pStyle w:val="NormalWeb"/>
+        <w:numPr>
+          <w:ilvl w:val="0"/>
+          <w:numId w:val="21"/>
+        </w:numPr>
+      </w:pPr>
+      <w:r>
+        <w:t>"Click here"</w:t>
+      </w:r>
+    </w:p>
+    <w:p>
+      <w:pPr>
+        <w:pStyle w:val="NormalWeb"/>
+        <w:numPr>
+          <w:ilvl w:val="0"/>
+          <w:numId w:val="21"/>
+        </w:numPr>
+      </w:pPr>
+      <w:r>
+        <w:t>"Try Yourself"</w:t>
+      </w:r>
+    </w:p>
+    <w:p>
+      <w:pPr>
+        <w:pStyle w:val="NormalWeb"/>
+        <w:numPr>
+          <w:ilvl w:val="0"/>
+          <w:numId w:val="21"/>
+        </w:numPr>
+      </w:pPr>
+      <w:r>
+        <w:t>Repeated procedural steps</w:t>
+      </w:r>
+    </w:p>
+    <w:p>
+      <w:pPr>
+        <w:pStyle w:val="Heading1"/>
+        <w:numPr>
+          <w:ilvl w:val="0"/>
+          <w:numId w:val="0"/>
+        </w:numPr>
+        <w:ind w:left="432" w:hanging="432"/>
+      </w:pPr>
+      <w:r>
+        <w:t>Writing Style</w:t>
+      </w:r>
+    </w:p>
+    <w:p>
+      <w:pPr>
+        <w:pStyle w:val="NormalWeb"/>
+      </w:pPr>
+      <w:r>
+        <w:t>Always write in a professional note-taking style.</w:t>
+      </w:r>
+    </w:p>
+    <w:p>
+      <w:pPr>
+        <w:pStyle w:val="NormalWeb"/>
+      </w:pPr>
+      <w:r>
+        <w:t>Use:</w:t>
+      </w:r>
+    </w:p>
+    <w:p>
+      <w:pPr>
+        <w:pStyle w:val="NormalWeb"/>
+        <w:numPr>
+          <w:ilvl w:val="0"/>
+          <w:numId w:val="22"/>
+        </w:numPr>
+      </w:pPr>
+      <w:r>
+        <w:t>"We"</w:t>
+      </w:r>
+    </w:p>
+    <w:p>
+      <w:pPr>
+        <w:pStyle w:val="NormalWeb"/>
+        <w:numPr>
+          <w:ilvl w:val="0"/>
+          <w:numId w:val="22"/>
+        </w:numPr>
+      </w:pPr>
+      <w:r>
+        <w:t>"Our"</w:t>
+      </w:r>
+    </w:p>
+    <w:p>
+      <w:pPr>
+        <w:pStyle w:val="NormalWeb"/>
+      </w:pPr>
+      <w:r>
+        <w:t>Never use:</w:t>
+      </w:r>
+    </w:p>
+    <w:p>
+      <w:pPr>
+        <w:pStyle w:val="NormalWeb"/>
+        <w:numPr>
+          <w:ilvl w:val="0"/>
+          <w:numId w:val="23"/>
+        </w:numPr>
+      </w:pPr>
+      <w:r>
+        <w:t>You</w:t>
+      </w:r>
+    </w:p>
+    <w:p>
+      <w:pPr>
+        <w:pStyle w:val="NormalWeb"/>
+        <w:numPr>
+          <w:ilvl w:val="0"/>
+          <w:numId w:val="23"/>
+        </w:numPr>
+      </w:pPr>
+      <w:r>
+        <w:t>Your</w:t>
+      </w:r>
+    </w:p>
+    <w:p>
+      <w:pPr>
+        <w:pStyle w:val="NormalWeb"/>
+        <w:numPr>
+          <w:ilvl w:val="0"/>
+          <w:numId w:val="23"/>
+        </w:numPr>
+      </w:pPr>
+      <w:r>
+        <w:t>I</w:t>
+      </w:r>
+    </w:p>
+    <w:p>
+      <w:pPr>
+        <w:pStyle w:val="NormalWeb"/>
+        <w:numPr>
+          <w:ilvl w:val="0"/>
+          <w:numId w:val="23"/>
+        </w:numPr>
+      </w:pPr>
+      <w:r>
+        <w:t>Me</w:t>
+      </w:r>
+    </w:p>
+    <w:p>
+      <w:pPr>
+        <w:pStyle w:val="NormalWeb"/>
+        <w:numPr>
+          <w:ilvl w:val="0"/>
+          <w:numId w:val="23"/>
+        </w:numPr>
+      </w:pPr>
+      <w:r>
+        <w:t>My</w:t>
+      </w:r>
+    </w:p>
+    <w:p>
+      <w:pPr>
+        <w:pStyle w:val="NormalWeb"/>
+      </w:pPr>
+      <w:r>
+        <w:lastRenderedPageBreak/>
+        <w:t>Example:</w:t>
+      </w:r>
+    </w:p>
+    <w:p>
+      <w:pPr>
+        <w:pStyle w:val="NormalWeb"/>
+      </w:pPr>
+      <w:r>
+        <w:rPr>
+          <w:rFonts w:ascii="Apple Color Emoji" w:hAnsi="Apple Color Emoji" w:cs="Apple Color Emoji"/>
+        </w:rPr>
+        <w:t>❌</w:t>
+      </w:r>
+      <w:r>
+        <w:t xml:space="preserve"> You will learn...</w:t>
+      </w:r>
+    </w:p>
+    <w:p>
+      <w:pPr>
+        <w:pStyle w:val="NormalWeb"/>
+      </w:pPr>
+      <w:r>
+        <w:rPr>
+          <w:rFonts w:ascii="Apple Color Emoji" w:hAnsi="Apple Color Emoji" w:cs="Apple Color Emoji"/>
+        </w:rPr>
+        <w:t>✅</w:t>
+      </w:r>
+      <w:r>
+        <w:t xml:space="preserve"> We learn...</w:t>
+      </w:r>
+    </w:p>
+    <w:p>
+      <w:pPr>
+        <w:pStyle w:val="Heading1"/>
+        <w:numPr>
+          <w:ilvl w:val="0"/>
+          <w:numId w:val="0"/>
+        </w:numPr>
+        <w:ind w:left="432" w:hanging="432"/>
+      </w:pPr>
+      <w:r>
+        <w:t>Exercise Formatting Rules</w:t>
+      </w:r>
+    </w:p>
+    <w:p>
+      <w:pPr>
+        <w:pStyle w:val="NormalWeb"/>
+      </w:pPr>
+      <w:r>
+        <w:t>For every exercise:</w:t>
+      </w:r>
+    </w:p>
+    <w:p>
+      <w:pPr>
+        <w:pStyle w:val="Heading2"/>
+        <w:numPr>
+          <w:ilvl w:val="0"/>
+          <w:numId w:val="0"/>
+        </w:numPr>
+        <w:ind w:left="576" w:hanging="576"/>
+      </w:pPr>
+      <w:r>
+        <w:t>Exercise Heading</w:t>
+      </w:r>
+    </w:p>
+    <w:p>
+      <w:pPr>
+        <w:pStyle w:val="NormalWeb"/>
+      </w:pPr>
+      <w:r>
+        <w:t>Keep the original exercise title.</w:t>
+      </w:r>
+    </w:p>
+    <w:p>
+      <w:pPr>
+        <w:pStyle w:val="Heading2"/>
+        <w:numPr>
+          <w:ilvl w:val="0"/>
+          <w:numId w:val="0"/>
+        </w:numPr>
+        <w:ind w:left="576" w:hanging="576"/>
+      </w:pPr>
+      <w:r>
+        <w:t>Purpose</w:t>
+      </w:r>
+    </w:p>
+    <w:p>
+      <w:pPr>
+        <w:pStyle w:val="NormalWeb"/>
+      </w:pPr>
+      <w:r>
+        <w:t>Write a short paragraph explaining the purpose of the exercise using the information provided in the source document.</w:t>
+      </w:r>
+    </w:p>
+    <w:p>
+      <w:pPr>
+        <w:pStyle w:val="NormalWeb"/>
+      </w:pPr>
+      <w:r>
+        <w:t>Do NOT invent information.</w:t>
+      </w:r>
+    </w:p>
+    <w:p>
+      <w:pPr>
+        <w:pStyle w:val="Heading2"/>
+        <w:numPr>
+          <w:ilvl w:val="0"/>
+          <w:numId w:val="0"/>
+        </w:numPr>
+        <w:ind w:left="576" w:hanging="576"/>
+      </w:pPr>
+      <w:r>
+        <w:t>Steps</w:t>
+      </w:r>
+    </w:p>
+    <w:p>
+      <w:pPr>
+        <w:pStyle w:val="NormalWeb"/>
+      </w:pPr>
+      <w:r>
+        <w:t>Only keep meaningful steps.</w:t>
+      </w:r>
+    </w:p>
+    <w:p>
+      <w:pPr>
+        <w:pStyle w:val="NormalWeb"/>
+      </w:pPr>
+      <w:r>
+        <w:t>For example:</w:t>
+      </w:r>
+    </w:p>
+    <w:p>
+      <w:pPr>
+        <w:pStyle w:val="NormalWeb"/>
+      </w:pPr>
+      <w:r>
+        <w:t>If a step only says</w:t>
+      </w:r>
+    </w:p>
+    <w:p>
+      <w:pPr>
+        <w:pStyle w:val="NormalWeb"/>
+      </w:pPr>
+      <w:r>
+        <w:t>"Log in"</w:t>
+      </w:r>
+    </w:p>
+    <w:p>
+      <w:pPr>
+        <w:pStyle w:val="NormalWeb"/>
+      </w:pPr>
+      <w:r>
+        <w:t>simply write</w:t>
+      </w:r>
+    </w:p>
+    <w:p>
+      <w:pPr>
+        <w:pStyle w:val="Heading3"/>
+        <w:numPr>
+          <w:ilvl w:val="0"/>
+          <w:numId w:val="0"/>
+        </w:numPr>
+        <w:ind w:left="720" w:hanging="720"/>
+      </w:pPr>
+      <w:r>
+        <w:t>Step 1: Log in to ChatGPT</w:t>
+      </w:r>
+    </w:p>
+    <w:p>
+      <w:pPr>
+        <w:pStyle w:val="NormalWeb"/>
+      </w:pPr>
+      <w:r>
+        <w:t>Do not include unnecessary explanations.</w:t>
+      </w:r>
+    </w:p>
+    <w:p>
+      <w:pPr>
+        <w:pStyle w:val="Heading2"/>
+        <w:numPr>
+          <w:ilvl w:val="0"/>
+          <w:numId w:val="0"/>
+        </w:numPr>
+        <w:ind w:left="576" w:hanging="576"/>
+      </w:pPr>
+      <w:r>
+        <w:t>Prompts</w:t>
+      </w:r>
+    </w:p>
+    <w:p>
+      <w:pPr>
+        <w:pStyle w:val="NormalWeb"/>
+      </w:pPr>
+      <w:r>
+        <w:t>Keep ALL important prompts exactly as written.</w:t>
+      </w:r>
+    </w:p>
+    <w:p>
+      <w:pPr>
+        <w:pStyle w:val="NormalWeb"/>
+      </w:pPr>
+      <w:r>
+        <w:t>Present them inside code blocks.</w:t>
+      </w:r>
+    </w:p>
+    <w:p>
+      <w:pPr>
+        <w:pStyle w:val="NormalWeb"/>
+      </w:pPr>
+      <w:r>
+        <w:t>Example</w:t>
+      </w:r>
+    </w:p>
+    <w:p>
+      <w:pPr>
+        <w:pStyle w:val="Heading3"/>
+        <w:numPr>
+          <w:ilvl w:val="0"/>
+          <w:numId w:val="0"/>
+        </w:numPr>
+        <w:ind w:left="720" w:hanging="720"/>
+      </w:pPr>
+      <w:r>
+        <w:t>Prompt</w:t>
+      </w:r>
+    </w:p>
+    <w:p>
+      <w:pPr>
+        <w:pStyle w:val="HTMLPreformatted"/>
+        <w:rPr>
+          <w:rStyle w:val="HTMLCode"/>
+          <w:rFonts w:eastAsiaTheme="majorEastAsia"/>
+        </w:rPr>
+      </w:pPr>
+      <w:r>
+        <w:rPr>
+          <w:rStyle w:val="HTMLCode"/>
+          <w:rFonts w:eastAsiaTheme="majorEastAsia"/>
+        </w:rPr>
+        <w:t>&lt;original prompt&gt;</w:t>
+      </w:r>
+    </w:p>
+    <w:p>
+      <w:pPr>
+        <w:pStyle w:val="NormalWeb"/>
+      </w:pPr>
+      <w:r>
+        <w:lastRenderedPageBreak/>
+        <w:t>If an exercise contains multiple prompts, organize them as:</w:t>
+      </w:r>
+    </w:p>
+    <w:p>
+      <w:pPr>
+        <w:pStyle w:val="NormalWeb"/>
+        <w:numPr>
+          <w:ilvl w:val="0"/>
+          <w:numId w:val="24"/>
+        </w:numPr>
+      </w:pPr>
+      <w:r>
+        <w:t>Prompt Instructions</w:t>
+      </w:r>
+    </w:p>
+    <w:p>
+      <w:pPr>
+        <w:pStyle w:val="NormalWeb"/>
+        <w:numPr>
+          <w:ilvl w:val="0"/>
+          <w:numId w:val="24"/>
+        </w:numPr>
+      </w:pPr>
+      <w:r>
+        <w:t>Prompt 1</w:t>
+      </w:r>
+    </w:p>
+    <w:p>
+      <w:pPr>
+        <w:pStyle w:val="NormalWeb"/>
+        <w:numPr>
+          <w:ilvl w:val="0"/>
+          <w:numId w:val="24"/>
+        </w:numPr>
+      </w:pPr>
+      <w:r>
+        <w:t>Prompt 2</w:t>
+      </w:r>
+    </w:p>
+    <w:p>
+      <w:pPr>
+        <w:pStyle w:val="NormalWeb"/>
+        <w:numPr>
+          <w:ilvl w:val="0"/>
+          <w:numId w:val="24"/>
+        </w:numPr>
+      </w:pPr>
+      <w:r>
+        <w:t>Prompt 3</w:t>
+      </w:r>
+    </w:p>
+    <w:p>
+      <w:pPr>
+        <w:pStyle w:val="Heading2"/>
+        <w:numPr>
+          <w:ilvl w:val="0"/>
+          <w:numId w:val="0"/>
+        </w:numPr>
+        <w:ind w:left="576" w:hanging="576"/>
+      </w:pPr>
+      <w:r>
+        <w:t>Commands</w:t>
+      </w:r>
+    </w:p>
+    <w:p>
+      <w:pPr>
+        <w:pStyle w:val="NormalWeb"/>
+      </w:pPr>
+      <w:r>
+        <w:t>If the exercise contains commands, APIs, SQL queries, terminal commands, Python code, or other technical snippets that help learning, include them in properly formatted code blocks.</w:t>
+      </w:r>
+    </w:p>
+    <w:p>
+      <w:pPr>
+        <w:pStyle w:val="Heading2"/>
+        <w:numPr>
+          <w:ilvl w:val="0"/>
+          <w:numId w:val="0"/>
+        </w:numPr>
+        <w:ind w:left="576" w:hanging="576"/>
+      </w:pPr>
+      <w:r>
+        <w:t>Important Lists</w:t>
+      </w:r>
+    </w:p>
+    <w:p>
+      <w:pPr>
+        <w:pStyle w:val="NormalWeb"/>
+      </w:pPr>
+      <w:r>
+        <w:t>If the exercise contains useful lists such as:</w:t>
+      </w:r>
+    </w:p>
+    <w:p>
+      <w:pPr>
+        <w:pStyle w:val="NormalWeb"/>
+        <w:numPr>
+          <w:ilvl w:val="0"/>
+          <w:numId w:val="25"/>
+        </w:numPr>
+      </w:pPr>
+      <w:r>
+        <w:t>Use cases</w:t>
+      </w:r>
+    </w:p>
+    <w:p>
+      <w:pPr>
+        <w:pStyle w:val="NormalWeb"/>
+        <w:numPr>
+          <w:ilvl w:val="0"/>
+          <w:numId w:val="25"/>
+        </w:numPr>
+      </w:pPr>
+      <w:r>
+        <w:t>Applications</w:t>
+      </w:r>
+    </w:p>
+    <w:p>
+      <w:pPr>
+        <w:pStyle w:val="NormalWeb"/>
+        <w:numPr>
+          <w:ilvl w:val="0"/>
+          <w:numId w:val="25"/>
+        </w:numPr>
+      </w:pPr>
+      <w:r>
+        <w:t>Features</w:t>
+      </w:r>
+    </w:p>
+    <w:p>
+      <w:pPr>
+        <w:pStyle w:val="NormalWeb"/>
+        <w:numPr>
+          <w:ilvl w:val="0"/>
+          <w:numId w:val="25"/>
+        </w:numPr>
+      </w:pPr>
+      <w:r>
+        <w:t>Best practices</w:t>
+      </w:r>
+    </w:p>
+    <w:p>
+      <w:pPr>
+        <w:pStyle w:val="NormalWeb"/>
+        <w:numPr>
+          <w:ilvl w:val="0"/>
+          <w:numId w:val="25"/>
+        </w:numPr>
+      </w:pPr>
+      <w:r>
+        <w:t>Ethical considerations</w:t>
+      </w:r>
+    </w:p>
+    <w:p>
+      <w:pPr>
+        <w:pStyle w:val="NormalWeb"/>
+        <w:numPr>
+          <w:ilvl w:val="0"/>
+          <w:numId w:val="25"/>
+        </w:numPr>
+      </w:pPr>
+      <w:r>
+        <w:t>Advantages</w:t>
+      </w:r>
+    </w:p>
+    <w:p>
+      <w:pPr>
+        <w:pStyle w:val="NormalWeb"/>
+        <w:numPr>
+          <w:ilvl w:val="0"/>
+          <w:numId w:val="25"/>
+        </w:numPr>
+      </w:pPr>
+      <w:r>
+        <w:t>Limitations</w:t>
+      </w:r>
+    </w:p>
+    <w:p>
+      <w:pPr>
+        <w:pStyle w:val="NormalWeb"/>
+        <w:numPr>
+          <w:ilvl w:val="0"/>
+          <w:numId w:val="25"/>
+        </w:numPr>
+      </w:pPr>
+      <w:r>
+        <w:t>Recommendations</w:t>
+      </w:r>
+    </w:p>
+    <w:p>
+      <w:pPr>
+        <w:pStyle w:val="NormalWeb"/>
+      </w:pPr>
+      <w:r>
+        <w:t>Include them as bullet points.</w:t>
+      </w:r>
+    </w:p>
+    <w:p>
+      <w:pPr>
+        <w:pStyle w:val="Heading2"/>
+        <w:numPr>
+          <w:ilvl w:val="0"/>
+          <w:numId w:val="0"/>
+        </w:numPr>
+        <w:ind w:left="576" w:hanging="576"/>
+      </w:pPr>
+      <w:r>
+        <w:t>Ethical Considerations</w:t>
+      </w:r>
+    </w:p>
+    <w:p>
+      <w:pPr>
+        <w:pStyle w:val="NormalWeb"/>
+      </w:pPr>
+      <w:r>
+        <w:t>Whenever an exercise contains ethical considerations, privacy concerns, security concerns, bias discussions, fairness considerations, or responsible AI practices:</w:t>
+      </w:r>
+    </w:p>
+    <w:p>
+      <w:pPr>
+        <w:pStyle w:val="NormalWeb"/>
+      </w:pPr>
+      <w:r>
+        <w:t>Create a separate section.</w:t>
+      </w:r>
+    </w:p>
+    <w:p>
+      <w:pPr>
+        <w:pStyle w:val="NormalWeb"/>
+      </w:pPr>
+      <w:r>
+        <w:t>Example:</w:t>
+      </w:r>
+    </w:p>
+    <w:p>
+      <w:pPr>
+        <w:pStyle w:val="Heading3"/>
+        <w:numPr>
+          <w:ilvl w:val="0"/>
+          <w:numId w:val="0"/>
+        </w:numPr>
+        <w:ind w:left="720" w:hanging="720"/>
+      </w:pPr>
+      <w:r>
+        <w:t>Ethical Considerations</w:t>
+      </w:r>
+    </w:p>
+    <w:p>
+      <w:pPr>
+        <w:pStyle w:val="Heading2"/>
+        <w:numPr>
+          <w:ilvl w:val="0"/>
+          <w:numId w:val="0"/>
+        </w:numPr>
+        <w:ind w:left="576" w:hanging="576"/>
+      </w:pPr>
+      <w:r>
+        <w:t>Summary</w:t>
+      </w:r>
+    </w:p>
+    <w:p>
+      <w:pPr>
+        <w:pStyle w:val="NormalWeb"/>
+      </w:pPr>
+      <w:r>
+        <w:t>Create a concise summary based only on the provided document.</w:t>
+      </w:r>
+    </w:p>
+    <w:p>
+      <w:pPr>
+        <w:pStyle w:val="NormalWeb"/>
+      </w:pPr>
+      <w:r>
+        <w:t>Do NOT write:</w:t>
+      </w:r>
+    </w:p>
+    <w:p>
+      <w:pPr>
+        <w:pStyle w:val="NormalWeb"/>
+      </w:pPr>
+      <w:r>
+        <w:t>"Congratulations"</w:t>
+      </w:r>
+    </w:p>
+    <w:p>
+      <w:pPr>
+        <w:pStyle w:val="NormalWeb"/>
+      </w:pPr>
+      <w:r>
+        <w:t>Do NOT mention completing the exercise.</w:t>
+      </w:r>
+    </w:p>
+    <w:p>
+      <w:pPr>
+        <w:pStyle w:val="NormalWeb"/>
+      </w:pPr>
+      <w:r>
+        <w:t>Simply summarize the concepts learned.</w:t>
+      </w:r>
+    </w:p>
+    <w:p>
+      <w:pPr>
+        <w:pStyle w:val="Heading1"/>
+        <w:numPr>
+          <w:ilvl w:val="0"/>
+          <w:numId w:val="0"/>
+        </w:numPr>
+        <w:ind w:left="432" w:hanging="432"/>
+      </w:pPr>
+      <w:r>
+        <w:lastRenderedPageBreak/>
+        <w:t>Important Constraints</w:t>
+      </w:r>
+    </w:p>
+    <w:p>
+      <w:pPr>
+        <w:pStyle w:val="NormalWeb"/>
+      </w:pPr>
+      <w:r>
+        <w:t>Never invent information.</w:t>
+      </w:r>
+    </w:p>
+    <w:p>
+      <w:pPr>
+        <w:pStyle w:val="NormalWeb"/>
+      </w:pPr>
+      <w:r>
+        <w:t>Never expand beyond what is present in the document.</w:t>
+      </w:r>
+    </w:p>
+    <w:p>
+      <w:pPr>
+        <w:pStyle w:val="NormalWeb"/>
+      </w:pPr>
+      <w:r>
+        <w:t>Never explain concepts using outside knowledge.</w:t>
+      </w:r>
+    </w:p>
+    <w:p>
+      <w:pPr>
+        <w:pStyle w:val="NormalWeb"/>
+      </w:pPr>
+      <w:r>
+        <w:t>Stay faithful to the original material.</w:t>
+      </w:r>
+    </w:p>
+    <w:p>
+      <w:pPr>
+        <w:pStyle w:val="Heading1"/>
+        <w:numPr>
+          <w:ilvl w:val="0"/>
+          <w:numId w:val="0"/>
+        </w:numPr>
+        <w:ind w:left="432" w:hanging="432"/>
+      </w:pPr>
+      <w:r>
+        <w:t>Output Formatting</w:t>
+      </w:r>
+    </w:p>
+    <w:p>
+      <w:pPr>
+        <w:pStyle w:val="NormalWeb"/>
+      </w:pPr>
+      <w:r>
+        <w:t>Use the following structure exactly.</w:t>
+      </w:r>
+    </w:p>
+    <w:p>
+      <w:pPr>
+        <w:pStyle w:val="Heading1"/>
+        <w:numPr>
+          <w:ilvl w:val="0"/>
+          <w:numId w:val="0"/>
+        </w:numPr>
+        <w:ind w:left="432" w:hanging="432"/>
+      </w:pPr>
+      <w:r>
+        <w:t>Main Title</w:t>
+      </w:r>
+    </w:p>
+    <w:p>
+      <w:pPr>
+        <w:pStyle w:val="Heading2"/>
+        <w:numPr>
+          <w:ilvl w:val="0"/>
+          <w:numId w:val="0"/>
+        </w:numPr>
+        <w:ind w:left="576" w:hanging="576"/>
+      </w:pPr>
+      <w:r>
+        <w:t>Learning Objectives</w:t>
+      </w:r>
+    </w:p>
+    <w:p>
+      <w:pPr>
+        <w:pStyle w:val="Heading2"/>
+        <w:numPr>
+          <w:ilvl w:val="0"/>
+          <w:numId w:val="0"/>
+        </w:numPr>
+        <w:ind w:left="576" w:hanging="576"/>
+      </w:pPr>
+      <w:r>
+        <w:t>Introduction</w:t>
+      </w:r>
+    </w:p>
+    <w:p>
+      <w:pPr>
+        <w:pStyle w:val="Heading1"/>
+        <w:numPr>
+          <w:ilvl w:val="0"/>
+          <w:numId w:val="0"/>
+        </w:numPr>
+        <w:ind w:left="432" w:hanging="432"/>
+      </w:pPr>
+      <w:r>
+        <w:t>Exercise 1: ...</w:t>
+      </w:r>
+    </w:p>
+    <w:p>
+      <w:pPr>
+        <w:pStyle w:val="NormalWeb"/>
+      </w:pPr>
+      <w:r>
+        <w:t>Purpose...</w:t>
+      </w:r>
+    </w:p>
+    <w:p>
+      <w:pPr>
+        <w:pStyle w:val="Heading3"/>
+        <w:numPr>
+          <w:ilvl w:val="0"/>
+          <w:numId w:val="0"/>
+        </w:numPr>
+        <w:ind w:left="720" w:hanging="720"/>
+      </w:pPr>
+      <w:r>
+        <w:t>Step 1</w:t>
+      </w:r>
+    </w:p>
+    <w:p>
+      <w:pPr>
+        <w:pStyle w:val="Heading3"/>
+        <w:numPr>
+          <w:ilvl w:val="0"/>
+          <w:numId w:val="0"/>
+        </w:numPr>
+        <w:ind w:left="720" w:hanging="720"/>
+        <w:rPr>
+          <w:rStyle w:val="HTMLCode"/>
+          <w:rFonts w:asciiTheme="majorBidi" w:eastAsiaTheme="majorEastAsia" w:hAnsiTheme="majorBidi" w:cstheme="majorBidi"/>
+          <w:sz w:val="24"/>
+          <w:szCs w:val="28"/>
+        </w:rPr>
+      </w:pPr>
+      <w:r>
+        <w:t>Prompt</w:t>
+      </w:r>
+    </w:p>
+    <w:p>
+      <w:pPr>
+        <w:pStyle w:val="Heading3"/>
+        <w:numPr>
+          <w:ilvl w:val="0"/>
+          <w:numId w:val="0"/>
+        </w:numPr>
+        <w:ind w:left="720" w:hanging="720"/>
+      </w:pPr>
+      <w:r>
+        <w:t>Important Points</w:t>
+      </w:r>
+    </w:p>
+    <w:p>
+      <w:pPr>
+        <w:pStyle w:val="Heading1"/>
+        <w:numPr>
+          <w:ilvl w:val="0"/>
+          <w:numId w:val="0"/>
+        </w:numPr>
+        <w:ind w:left="432" w:hanging="432"/>
+      </w:pPr>
+      <w:r>
+        <w:t>Exercise 2: ...</w:t>
+      </w:r>
+    </w:p>
+    <w:p>
+      <w:pPr>
+        <w:pStyle w:val="NormalWeb"/>
+      </w:pPr>
+      <w:r>
+        <w:t>Purpose...</w:t>
+      </w:r>
+    </w:p>
+    <w:p>
+      <w:pPr>
+        <w:pStyle w:val="Heading3"/>
+        <w:numPr>
+          <w:ilvl w:val="0"/>
+          <w:numId w:val="0"/>
+        </w:numPr>
+        <w:ind w:left="720" w:hanging="720"/>
+        <w:rPr>
+          <w:rStyle w:val="HTMLCode"/>
+          <w:rFonts w:asciiTheme="majorBidi" w:eastAsiaTheme="majorEastAsia" w:hAnsiTheme="majorBidi" w:cstheme="majorBidi"/>
+          <w:sz w:val="24"/>
+          <w:szCs w:val="28"/>
+        </w:rPr>
+      </w:pPr>
+      <w:r>
+        <w:t>Prompt</w:t>
+      </w:r>
+    </w:p>
+    <w:p>
+      <w:pPr>
+        <w:pStyle w:val="Heading3"/>
+        <w:numPr>
+          <w:ilvl w:val="0"/>
+          <w:numId w:val="0"/>
+        </w:numPr>
+      </w:pPr>
+      <w:r>
+        <w:t>Ethical Considerations</w:t>
+      </w:r>
+    </w:p>
+    <w:p>
+      <w:pPr>
+        <w:pStyle w:val="Heading1"/>
+        <w:numPr>
+          <w:ilvl w:val="0"/>
+          <w:numId w:val="0"/>
+        </w:numPr>
+        <w:ind w:left="432" w:hanging="432"/>
+      </w:pPr>
+      <w:r>
+        <w:t>Exercise N</w:t>
+      </w:r>
+    </w:p>
+    <w:p>
+      <w:pPr>
+        <w:pStyle w:val="Heading2"/>
+        <w:numPr>
+          <w:ilvl w:val="0"/>
+          <w:numId w:val="0"/>
+        </w:numPr>
+        <w:ind w:left="576" w:hanging="576"/>
+      </w:pPr>
+      <w:r>
+        <w:t>Summary</w:t>
+      </w:r>
+    </w:p>
+    <w:p>
+      <w:pPr>
+        <w:pStyle w:val="Heading1"/>
+        <w:numPr>
+          <w:ilvl w:val="0"/>
+          <w:numId w:val="0"/>
+        </w:numPr>
+        <w:ind w:left="432" w:hanging="432"/>
+      </w:pPr>
+      <w:r>
+        <w:t>Quality Requirements</w:t>
+      </w:r>
+    </w:p>
+    <w:p>
+      <w:pPr>
+        <w:pStyle w:val="NormalWeb"/>
+      </w:pPr>
+      <w:r>
+        <w:t>The final notes should:</w:t>
+      </w:r>
+    </w:p>
+    <w:p>
+      <w:pPr>
+        <w:pStyle w:val="NormalWeb"/>
+        <w:numPr>
+          <w:ilvl w:val="0"/>
+          <w:numId w:val="28"/>
+        </w:numPr>
+      </w:pPr>
+      <w:r>
+        <w:t>Preserve all important educational content.</w:t>
+      </w:r>
+    </w:p>
+    <w:p>
+      <w:pPr>
+        <w:pStyle w:val="NormalWeb"/>
+        <w:numPr>
+          <w:ilvl w:val="0"/>
+          <w:numId w:val="28"/>
+        </w:numPr>
+      </w:pPr>
+      <w:r>
+        <w:t>Remove unnecessary procedural content.</w:t>
+      </w:r>
+    </w:p>
+    <w:p>
+      <w:pPr>
+        <w:pStyle w:val="NormalWeb"/>
+        <w:numPr>
+          <w:ilvl w:val="0"/>
+          <w:numId w:val="28"/>
+        </w:numPr>
+      </w:pPr>
+      <w:r>
+        <w:t>Preserve original terminology.</w:t>
+      </w:r>
+    </w:p>
+    <w:p>
+      <w:pPr>
+        <w:pStyle w:val="NormalWeb"/>
+        <w:numPr>
+          <w:ilvl w:val="0"/>
+          <w:numId w:val="28"/>
+        </w:numPr>
+      </w:pPr>
+      <w:r>
+        <w:t>Use headings, bullet points, and code blocks where appropriate.</w:t>
+      </w:r>
+    </w:p>
+    <w:p>
+      <w:pPr>
+        <w:pStyle w:val="NormalWeb"/>
+        <w:numPr>
+          <w:ilvl w:val="0"/>
+          <w:numId w:val="28"/>
+        </w:numPr>
+      </w:pPr>
+      <w:r>
+        <w:t>Be easy to read during future revision.</w:t>
+      </w:r>
+    </w:p>
+    <w:p>
+      <w:pPr>
+        <w:rPr>
+          <w:rFonts w:asciiTheme="majorBidi" w:hAnsiTheme="majorBidi" w:cstheme="majorBidi"/>
+          <w:lang w:val="en-US"/>
+        </w:rPr>
+      </w:pPr>
     </w:p>
     <w:sectPr>
       <w:pgSz w:w="11906" w:h="16838"/>
@@ -4645,6 +6222,155 @@
     </w:lvl>
   </w:abstractNum>
   <w:abstractNum w:abstractNumId="1" w15:restartNumberingAfterBreak="0">
+    <w:nsid w:val="0D6A4C9C"/>
+    <w:multiLevelType w:val="multilevel"/>
+    <w:tmpl w:val="B8902542"/>
+    <w:lvl w:ilvl="0">
+      <w:start w:val="1"/>
+      <w:numFmt w:val="bullet"/>
+      <w:lvlText w:val=""/>
+      <w:lvlJc w:val="left"/>
+      <w:pPr>
+        <w:tabs>
+          <w:tab w:val="num" w:pos="720"/>
+        </w:tabs>
+        <w:ind w:left="720" w:hanging="360"/>
+      </w:pPr>
+      <w:rPr>
+        <w:rFonts w:ascii="Symbol" w:hAnsi="Symbol" w:hint="default"/>
+        <w:sz w:val="20"/>
+      </w:rPr>
+    </w:lvl>
+    <w:lvl w:ilvl="1" w:tentative="1">
+      <w:start w:val="1"/>
+      <w:numFmt w:val="bullet"/>
+      <w:lvlText w:val="o"/>
+      <w:lvlJc w:val="left"/>
+      <w:pPr>
+        <w:tabs>
+          <w:tab w:val="num" w:pos="1440"/>
+        </w:tabs>
+        <w:ind w:left="1440" w:hanging="360"/>
+      </w:pPr>
+      <w:rPr>
+        <w:rFonts w:ascii="Courier New" w:hAnsi="Courier New" w:hint="default"/>
+        <w:sz w:val="20"/>
+      </w:rPr>
+    </w:lvl>
+    <w:lvl w:ilvl="2" w:tentative="1">
+      <w:start w:val="1"/>
+      <w:numFmt w:val="bullet"/>
+      <w:lvlText w:val=""/>
+      <w:lvlJc w:val="left"/>
+      <w:pPr>
+        <w:tabs>
+          <w:tab w:val="num" w:pos="2160"/>
+        </w:tabs>
+        <w:ind w:left="2160" w:hanging="360"/>
+      </w:pPr>
+      <w:rPr>
+        <w:rFonts w:ascii="Wingdings" w:hAnsi="Wingdings" w:hint="default"/>
+        <w:sz w:val="20"/>
+      </w:rPr>
+    </w:lvl>
+    <w:lvl w:ilvl="3" w:tentative="1">
+      <w:start w:val="1"/>
+      <w:numFmt w:val="bullet"/>
+      <w:lvlText w:val=""/>
+      <w:lvlJc w:val="left"/>
+      <w:pPr>
+        <w:tabs>
+          <w:tab w:val="num" w:pos="2880"/>
+        </w:tabs>
+        <w:ind w:left="2880" w:hanging="360"/>
+      </w:pPr>
+      <w:rPr>
+        <w:rFonts w:ascii="Wingdings" w:hAnsi="Wingdings" w:hint="default"/>
+        <w:sz w:val="20"/>
+      </w:rPr>
+    </w:lvl>
+    <w:lvl w:ilvl="4" w:tentative="1">
+      <w:start w:val="1"/>
+      <w:numFmt w:val="bullet"/>
+      <w:lvlText w:val=""/>
+      <w:lvlJc w:val="left"/>
+      <w:pPr>
+        <w:tabs>
+          <w:tab w:val="num" w:pos="3600"/>
+        </w:tabs>
+        <w:ind w:left="3600" w:hanging="360"/>
+      </w:pPr>
+      <w:rPr>
+        <w:rFonts w:ascii="Wingdings" w:hAnsi="Wingdings" w:hint="default"/>
+        <w:sz w:val="20"/>
+      </w:rPr>
+    </w:lvl>
+    <w:lvl w:ilvl="5" w:tentative="1">
+      <w:start w:val="1"/>
+      <w:numFmt w:val="bullet"/>
+      <w:lvlText w:val=""/>
+      <w:lvlJc w:val="left"/>
+      <w:pPr>
+        <w:tabs>
+          <w:tab w:val="num" w:pos="4320"/>
+        </w:tabs>
+        <w:ind w:left="4320" w:hanging="360"/>
+      </w:pPr>
+      <w:rPr>
+        <w:rFonts w:ascii="Wingdings" w:hAnsi="Wingdings" w:hint="default"/>
+        <w:sz w:val="20"/>
+      </w:rPr>
+    </w:lvl>
+    <w:lvl w:ilvl="6" w:tentative="1">
+      <w:start w:val="1"/>
+      <w:numFmt w:val="bullet"/>
+      <w:lvlText w:val=""/>
+      <w:lvlJc w:val="left"/>
+      <w:pPr>
+        <w:tabs>
+          <w:tab w:val="num" w:pos="5040"/>
+        </w:tabs>
+        <w:ind w:left="5040" w:hanging="360"/>
+      </w:pPr>
+      <w:rPr>
+        <w:rFonts w:ascii="Wingdings" w:hAnsi="Wingdings" w:hint="default"/>
+        <w:sz w:val="20"/>
+      </w:rPr>
+    </w:lvl>
+    <w:lvl w:ilvl="7" w:tentative="1">
+      <w:start w:val="1"/>
+      <w:numFmt w:val="bullet"/>
+      <w:lvlText w:val=""/>
+      <w:lvlJc w:val="left"/>
+      <w:pPr>
+        <w:tabs>
+          <w:tab w:val="num" w:pos="5760"/>
+        </w:tabs>
+        <w:ind w:left="5760" w:hanging="360"/>
+      </w:pPr>
+      <w:rPr>
+        <w:rFonts w:ascii="Wingdings" w:hAnsi="Wingdings" w:hint="default"/>
+        <w:sz w:val="20"/>
+      </w:rPr>
+    </w:lvl>
+    <w:lvl w:ilvl="8" w:tentative="1">
+      <w:start w:val="1"/>
+      <w:numFmt w:val="bullet"/>
+      <w:lvlText w:val=""/>
+      <w:lvlJc w:val="left"/>
+      <w:pPr>
+        <w:tabs>
+          <w:tab w:val="num" w:pos="6480"/>
+        </w:tabs>
+        <w:ind w:left="6480" w:hanging="360"/>
+      </w:pPr>
+      <w:rPr>
+        <w:rFonts w:ascii="Wingdings" w:hAnsi="Wingdings" w:hint="default"/>
+        <w:sz w:val="20"/>
+      </w:rPr>
+    </w:lvl>
+  </w:abstractNum>
+  <w:abstractNum w:abstractNumId="2" w15:restartNumberingAfterBreak="0">
     <w:nsid w:val="11CD1041"/>
     <w:multiLevelType w:val="multilevel"/>
     <w:tmpl w:val="08090025"/>
@@ -4739,7 +6465,7 @@
       </w:pPr>
     </w:lvl>
   </w:abstractNum>
-  <w:abstractNum w:abstractNumId="2" w15:restartNumberingAfterBreak="0">
+  <w:abstractNum w:abstractNumId="3" w15:restartNumberingAfterBreak="0">
     <w:nsid w:val="18732D77"/>
     <w:multiLevelType w:val="hybridMultilevel"/>
     <w:tmpl w:val="B2BC81FC"/>
@@ -4825,7 +6551,7 @@
       </w:pPr>
     </w:lvl>
   </w:abstractNum>
-  <w:abstractNum w:abstractNumId="3" w15:restartNumberingAfterBreak="0">
+  <w:abstractNum w:abstractNumId="4" w15:restartNumberingAfterBreak="0">
     <w:nsid w:val="1E8A51C4"/>
     <w:multiLevelType w:val="hybridMultilevel"/>
     <w:tmpl w:val="15E42046"/>
@@ -4911,7 +6637,156 @@
       </w:pPr>
     </w:lvl>
   </w:abstractNum>
-  <w:abstractNum w:abstractNumId="4" w15:restartNumberingAfterBreak="0">
+  <w:abstractNum w:abstractNumId="5" w15:restartNumberingAfterBreak="0">
+    <w:nsid w:val="2A8E51D1"/>
+    <w:multiLevelType w:val="multilevel"/>
+    <w:tmpl w:val="B8902542"/>
+    <w:lvl w:ilvl="0">
+      <w:start w:val="1"/>
+      <w:numFmt w:val="bullet"/>
+      <w:lvlText w:val=""/>
+      <w:lvlJc w:val="left"/>
+      <w:pPr>
+        <w:tabs>
+          <w:tab w:val="num" w:pos="720"/>
+        </w:tabs>
+        <w:ind w:left="720" w:hanging="360"/>
+      </w:pPr>
+      <w:rPr>
+        <w:rFonts w:ascii="Symbol" w:hAnsi="Symbol" w:hint="default"/>
+        <w:sz w:val="20"/>
+      </w:rPr>
+    </w:lvl>
+    <w:lvl w:ilvl="1" w:tentative="1">
+      <w:start w:val="1"/>
+      <w:numFmt w:val="bullet"/>
+      <w:lvlText w:val="o"/>
+      <w:lvlJc w:val="left"/>
+      <w:pPr>
+        <w:tabs>
+          <w:tab w:val="num" w:pos="1440"/>
+        </w:tabs>
+        <w:ind w:left="1440" w:hanging="360"/>
+      </w:pPr>
+      <w:rPr>
+        <w:rFonts w:ascii="Courier New" w:hAnsi="Courier New" w:hint="default"/>
+        <w:sz w:val="20"/>
+      </w:rPr>
+    </w:lvl>
+    <w:lvl w:ilvl="2" w:tentative="1">
+      <w:start w:val="1"/>
+      <w:numFmt w:val="bullet"/>
+      <w:lvlText w:val=""/>
+      <w:lvlJc w:val="left"/>
+      <w:pPr>
+        <w:tabs>
+          <w:tab w:val="num" w:pos="2160"/>
+        </w:tabs>
+        <w:ind w:left="2160" w:hanging="360"/>
+      </w:pPr>
+      <w:rPr>
+        <w:rFonts w:ascii="Wingdings" w:hAnsi="Wingdings" w:hint="default"/>
+        <w:sz w:val="20"/>
+      </w:rPr>
+    </w:lvl>
+    <w:lvl w:ilvl="3" w:tentative="1">
+      <w:start w:val="1"/>
+      <w:numFmt w:val="bullet"/>
+      <w:lvlText w:val=""/>
+      <w:lvlJc w:val="left"/>
+      <w:pPr>
+        <w:tabs>
+          <w:tab w:val="num" w:pos="2880"/>
+        </w:tabs>
+        <w:ind w:left="2880" w:hanging="360"/>
+      </w:pPr>
+      <w:rPr>
+        <w:rFonts w:ascii="Wingdings" w:hAnsi="Wingdings" w:hint="default"/>
+        <w:sz w:val="20"/>
+      </w:rPr>
+    </w:lvl>
+    <w:lvl w:ilvl="4" w:tentative="1">
+      <w:start w:val="1"/>
+      <w:numFmt w:val="bullet"/>
+      <w:lvlText w:val=""/>
+      <w:lvlJc w:val="left"/>
+      <w:pPr>
+        <w:tabs>
+          <w:tab w:val="num" w:pos="3600"/>
+        </w:tabs>
+        <w:ind w:left="3600" w:hanging="360"/>
+      </w:pPr>
+      <w:rPr>
+        <w:rFonts w:ascii="Wingdings" w:hAnsi="Wingdings" w:hint="default"/>
+        <w:sz w:val="20"/>
+      </w:rPr>
+    </w:lvl>
+    <w:lvl w:ilvl="5" w:tentative="1">
+      <w:start w:val="1"/>
+      <w:numFmt w:val="bullet"/>
+      <w:lvlText w:val=""/>
+      <w:lvlJc w:val="left"/>
+      <w:pPr>
+        <w:tabs>
+          <w:tab w:val="num" w:pos="4320"/>
+        </w:tabs>
+        <w:ind w:left="4320" w:hanging="360"/>
+      </w:pPr>
+      <w:rPr>
+        <w:rFonts w:ascii="Wingdings" w:hAnsi="Wingdings" w:hint="default"/>
+        <w:sz w:val="20"/>
+      </w:rPr>
+    </w:lvl>
+    <w:lvl w:ilvl="6" w:tentative="1">
+      <w:start w:val="1"/>
+      <w:numFmt w:val="bullet"/>
+      <w:lvlText w:val=""/>
+      <w:lvlJc w:val="left"/>
+      <w:pPr>
+        <w:tabs>
+          <w:tab w:val="num" w:pos="5040"/>
+        </w:tabs>
+        <w:ind w:left="5040" w:hanging="360"/>
+      </w:pPr>
+      <w:rPr>
+        <w:rFonts w:ascii="Wingdings" w:hAnsi="Wingdings" w:hint="default"/>
+        <w:sz w:val="20"/>
+      </w:rPr>
+    </w:lvl>
+    <w:lvl w:ilvl="7" w:tentative="1">
+      <w:start w:val="1"/>
+      <w:numFmt w:val="bullet"/>
+      <w:lvlText w:val=""/>
+      <w:lvlJc w:val="left"/>
+      <w:pPr>
+        <w:tabs>
+          <w:tab w:val="num" w:pos="5760"/>
+        </w:tabs>
+        <w:ind w:left="5760" w:hanging="360"/>
+      </w:pPr>
+      <w:rPr>
+        <w:rFonts w:ascii="Wingdings" w:hAnsi="Wingdings" w:hint="default"/>
+        <w:sz w:val="20"/>
+      </w:rPr>
+    </w:lvl>
+    <w:lvl w:ilvl="8" w:tentative="1">
+      <w:start w:val="1"/>
+      <w:numFmt w:val="bullet"/>
+      <w:lvlText w:val=""/>
+      <w:lvlJc w:val="left"/>
+      <w:pPr>
+        <w:tabs>
+          <w:tab w:val="num" w:pos="6480"/>
+        </w:tabs>
+        <w:ind w:left="6480" w:hanging="360"/>
+      </w:pPr>
+      <w:rPr>
+        <w:rFonts w:ascii="Wingdings" w:hAnsi="Wingdings" w:hint="default"/>
+        <w:sz w:val="20"/>
+      </w:rPr>
+    </w:lvl>
+  </w:abstractNum>
+  <w:abstractNum w:abstractNumId="6" w15:restartNumberingAfterBreak="0">
     <w:nsid w:val="301A156A"/>
     <w:multiLevelType w:val="hybridMultilevel"/>
     <w:tmpl w:val="6DE2E76E"/>
@@ -4997,7 +6872,7 @@
       </w:pPr>
     </w:lvl>
   </w:abstractNum>
-  <w:abstractNum w:abstractNumId="5" w15:restartNumberingAfterBreak="0">
+  <w:abstractNum w:abstractNumId="7" w15:restartNumberingAfterBreak="0">
     <w:nsid w:val="33DC41F7"/>
     <w:multiLevelType w:val="hybridMultilevel"/>
     <w:tmpl w:val="A5E49B3C"/>
@@ -5083,7 +6958,156 @@
       </w:pPr>
     </w:lvl>
   </w:abstractNum>
-  <w:abstractNum w:abstractNumId="6" w15:restartNumberingAfterBreak="0">
+  <w:abstractNum w:abstractNumId="8" w15:restartNumberingAfterBreak="0">
+    <w:nsid w:val="36BA33F9"/>
+    <w:multiLevelType w:val="multilevel"/>
+    <w:tmpl w:val="B8902542"/>
+    <w:lvl w:ilvl="0">
+      <w:start w:val="1"/>
+      <w:numFmt w:val="bullet"/>
+      <w:lvlText w:val=""/>
+      <w:lvlJc w:val="left"/>
+      <w:pPr>
+        <w:tabs>
+          <w:tab w:val="num" w:pos="720"/>
+        </w:tabs>
+        <w:ind w:left="720" w:hanging="360"/>
+      </w:pPr>
+      <w:rPr>
+        <w:rFonts w:ascii="Symbol" w:hAnsi="Symbol" w:hint="default"/>
+        <w:sz w:val="20"/>
+      </w:rPr>
+    </w:lvl>
+    <w:lvl w:ilvl="1" w:tentative="1">
+      <w:start w:val="1"/>
+      <w:numFmt w:val="bullet"/>
+      <w:lvlText w:val="o"/>
+      <w:lvlJc w:val="left"/>
+      <w:pPr>
+        <w:tabs>
+          <w:tab w:val="num" w:pos="1440"/>
+        </w:tabs>
+        <w:ind w:left="1440" w:hanging="360"/>
+      </w:pPr>
+      <w:rPr>
+        <w:rFonts w:ascii="Courier New" w:hAnsi="Courier New" w:hint="default"/>
+        <w:sz w:val="20"/>
+      </w:rPr>
+    </w:lvl>
+    <w:lvl w:ilvl="2" w:tentative="1">
+      <w:start w:val="1"/>
+      <w:numFmt w:val="bullet"/>
+      <w:lvlText w:val=""/>
+      <w:lvlJc w:val="left"/>
+      <w:pPr>
+        <w:tabs>
+          <w:tab w:val="num" w:pos="2160"/>
+        </w:tabs>
+        <w:ind w:left="2160" w:hanging="360"/>
+      </w:pPr>
+      <w:rPr>
+        <w:rFonts w:ascii="Wingdings" w:hAnsi="Wingdings" w:hint="default"/>
+        <w:sz w:val="20"/>
+      </w:rPr>
+    </w:lvl>
+    <w:lvl w:ilvl="3" w:tentative="1">
+      <w:start w:val="1"/>
+      <w:numFmt w:val="bullet"/>
+      <w:lvlText w:val=""/>
+      <w:lvlJc w:val="left"/>
+      <w:pPr>
+        <w:tabs>
+          <w:tab w:val="num" w:pos="2880"/>
+        </w:tabs>
+        <w:ind w:left="2880" w:hanging="360"/>
+      </w:pPr>
+      <w:rPr>
+        <w:rFonts w:ascii="Wingdings" w:hAnsi="Wingdings" w:hint="default"/>
+        <w:sz w:val="20"/>
+      </w:rPr>
+    </w:lvl>
+    <w:lvl w:ilvl="4" w:tentative="1">
+      <w:start w:val="1"/>
+      <w:numFmt w:val="bullet"/>
+      <w:lvlText w:val=""/>
+      <w:lvlJc w:val="left"/>
+      <w:pPr>
+        <w:tabs>
+          <w:tab w:val="num" w:pos="3600"/>
+        </w:tabs>
+        <w:ind w:left="3600" w:hanging="360"/>
+      </w:pPr>
+      <w:rPr>
+        <w:rFonts w:ascii="Wingdings" w:hAnsi="Wingdings" w:hint="default"/>
+        <w:sz w:val="20"/>
+      </w:rPr>
+    </w:lvl>
+    <w:lvl w:ilvl="5" w:tentative="1">
+      <w:start w:val="1"/>
+      <w:numFmt w:val="bullet"/>
+      <w:lvlText w:val=""/>
+      <w:lvlJc w:val="left"/>
+      <w:pPr>
+        <w:tabs>
+          <w:tab w:val="num" w:pos="4320"/>
+        </w:tabs>
+        <w:ind w:left="4320" w:hanging="360"/>
+      </w:pPr>
+      <w:rPr>
+        <w:rFonts w:ascii="Wingdings" w:hAnsi="Wingdings" w:hint="default"/>
+        <w:sz w:val="20"/>
+      </w:rPr>
+    </w:lvl>
+    <w:lvl w:ilvl="6" w:tentative="1">
+      <w:start w:val="1"/>
+      <w:numFmt w:val="bullet"/>
+      <w:lvlText w:val=""/>
+      <w:lvlJc w:val="left"/>
+      <w:pPr>
+        <w:tabs>
+          <w:tab w:val="num" w:pos="5040"/>
+        </w:tabs>
+        <w:ind w:left="5040" w:hanging="360"/>
+      </w:pPr>
+      <w:rPr>
+        <w:rFonts w:ascii="Wingdings" w:hAnsi="Wingdings" w:hint="default"/>
+        <w:sz w:val="20"/>
+      </w:rPr>
+    </w:lvl>
+    <w:lvl w:ilvl="7" w:tentative="1">
+      <w:start w:val="1"/>
+      <w:numFmt w:val="bullet"/>
+      <w:lvlText w:val=""/>
+      <w:lvlJc w:val="left"/>
+      <w:pPr>
+        <w:tabs>
+          <w:tab w:val="num" w:pos="5760"/>
+        </w:tabs>
+        <w:ind w:left="5760" w:hanging="360"/>
+      </w:pPr>
+      <w:rPr>
+        <w:rFonts w:ascii="Wingdings" w:hAnsi="Wingdings" w:hint="default"/>
+        <w:sz w:val="20"/>
+      </w:rPr>
+    </w:lvl>
+    <w:lvl w:ilvl="8" w:tentative="1">
+      <w:start w:val="1"/>
+      <w:numFmt w:val="bullet"/>
+      <w:lvlText w:val=""/>
+      <w:lvlJc w:val="left"/>
+      <w:pPr>
+        <w:tabs>
+          <w:tab w:val="num" w:pos="6480"/>
+        </w:tabs>
+        <w:ind w:left="6480" w:hanging="360"/>
+      </w:pPr>
+      <w:rPr>
+        <w:rFonts w:ascii="Wingdings" w:hAnsi="Wingdings" w:hint="default"/>
+        <w:sz w:val="20"/>
+      </w:rPr>
+    </w:lvl>
+  </w:abstractNum>
+  <w:abstractNum w:abstractNumId="9" w15:restartNumberingAfterBreak="0">
     <w:nsid w:val="384C78CB"/>
     <w:multiLevelType w:val="multilevel"/>
     <w:tmpl w:val="902C75D2"/>
@@ -5169,7 +7193,156 @@
       </w:pPr>
     </w:lvl>
   </w:abstractNum>
-  <w:abstractNum w:abstractNumId="7" w15:restartNumberingAfterBreak="0">
+  <w:abstractNum w:abstractNumId="10" w15:restartNumberingAfterBreak="0">
+    <w:nsid w:val="38BD6969"/>
+    <w:multiLevelType w:val="multilevel"/>
+    <w:tmpl w:val="B8902542"/>
+    <w:lvl w:ilvl="0">
+      <w:start w:val="1"/>
+      <w:numFmt w:val="bullet"/>
+      <w:lvlText w:val=""/>
+      <w:lvlJc w:val="left"/>
+      <w:pPr>
+        <w:tabs>
+          <w:tab w:val="num" w:pos="720"/>
+        </w:tabs>
+        <w:ind w:left="720" w:hanging="360"/>
+      </w:pPr>
+      <w:rPr>
+        <w:rFonts w:ascii="Symbol" w:hAnsi="Symbol" w:hint="default"/>
+        <w:sz w:val="20"/>
+      </w:rPr>
+    </w:lvl>
+    <w:lvl w:ilvl="1" w:tentative="1">
+      <w:start w:val="1"/>
+      <w:numFmt w:val="bullet"/>
+      <w:lvlText w:val="o"/>
+      <w:lvlJc w:val="left"/>
+      <w:pPr>
+        <w:tabs>
+          <w:tab w:val="num" w:pos="1440"/>
+        </w:tabs>
+        <w:ind w:left="1440" w:hanging="360"/>
+      </w:pPr>
+      <w:rPr>
+        <w:rFonts w:ascii="Courier New" w:hAnsi="Courier New" w:hint="default"/>
+        <w:sz w:val="20"/>
+      </w:rPr>
+    </w:lvl>
+    <w:lvl w:ilvl="2" w:tentative="1">
+      <w:start w:val="1"/>
+      <w:numFmt w:val="bullet"/>
+      <w:lvlText w:val=""/>
+      <w:lvlJc w:val="left"/>
+      <w:pPr>
+        <w:tabs>
+          <w:tab w:val="num" w:pos="2160"/>
+        </w:tabs>
+        <w:ind w:left="2160" w:hanging="360"/>
+      </w:pPr>
+      <w:rPr>
+        <w:rFonts w:ascii="Wingdings" w:hAnsi="Wingdings" w:hint="default"/>
+        <w:sz w:val="20"/>
+      </w:rPr>
+    </w:lvl>
+    <w:lvl w:ilvl="3" w:tentative="1">
+      <w:start w:val="1"/>
+      <w:numFmt w:val="bullet"/>
+      <w:lvlText w:val=""/>
+      <w:lvlJc w:val="left"/>
+      <w:pPr>
+        <w:tabs>
+          <w:tab w:val="num" w:pos="2880"/>
+        </w:tabs>
+        <w:ind w:left="2880" w:hanging="360"/>
+      </w:pPr>
+      <w:rPr>
+        <w:rFonts w:ascii="Wingdings" w:hAnsi="Wingdings" w:hint="default"/>
+        <w:sz w:val="20"/>
+      </w:rPr>
+    </w:lvl>
+    <w:lvl w:ilvl="4" w:tentative="1">
+      <w:start w:val="1"/>
+      <w:numFmt w:val="bullet"/>
+      <w:lvlText w:val=""/>
+      <w:lvlJc w:val="left"/>
+      <w:pPr>
+        <w:tabs>
+          <w:tab w:val="num" w:pos="3600"/>
+        </w:tabs>
+        <w:ind w:left="3600" w:hanging="360"/>
+      </w:pPr>
+      <w:rPr>
+        <w:rFonts w:ascii="Wingdings" w:hAnsi="Wingdings" w:hint="default"/>
+        <w:sz w:val="20"/>
+      </w:rPr>
+    </w:lvl>
+    <w:lvl w:ilvl="5" w:tentative="1">
+      <w:start w:val="1"/>
+      <w:numFmt w:val="bullet"/>
+      <w:lvlText w:val=""/>
+      <w:lvlJc w:val="left"/>
+      <w:pPr>
+        <w:tabs>
+          <w:tab w:val="num" w:pos="4320"/>
+        </w:tabs>
+        <w:ind w:left="4320" w:hanging="360"/>
+      </w:pPr>
+      <w:rPr>
+        <w:rFonts w:ascii="Wingdings" w:hAnsi="Wingdings" w:hint="default"/>
+        <w:sz w:val="20"/>
+      </w:rPr>
+    </w:lvl>
+    <w:lvl w:ilvl="6" w:tentative="1">
+      <w:start w:val="1"/>
+      <w:numFmt w:val="bullet"/>
+      <w:lvlText w:val=""/>
+      <w:lvlJc w:val="left"/>
+      <w:pPr>
+        <w:tabs>
+          <w:tab w:val="num" w:pos="5040"/>
+        </w:tabs>
+        <w:ind w:left="5040" w:hanging="360"/>
+      </w:pPr>
+      <w:rPr>
+        <w:rFonts w:ascii="Wingdings" w:hAnsi="Wingdings" w:hint="default"/>
+        <w:sz w:val="20"/>
+      </w:rPr>
+    </w:lvl>
+    <w:lvl w:ilvl="7" w:tentative="1">
+      <w:start w:val="1"/>
+      <w:numFmt w:val="bullet"/>
+      <w:lvlText w:val=""/>
+      <w:lvlJc w:val="left"/>
+      <w:pPr>
+        <w:tabs>
+          <w:tab w:val="num" w:pos="5760"/>
+        </w:tabs>
+        <w:ind w:left="5760" w:hanging="360"/>
+      </w:pPr>
+      <w:rPr>
+        <w:rFonts w:ascii="Wingdings" w:hAnsi="Wingdings" w:hint="default"/>
+        <w:sz w:val="20"/>
+      </w:rPr>
+    </w:lvl>
+    <w:lvl w:ilvl="8" w:tentative="1">
+      <w:start w:val="1"/>
+      <w:numFmt w:val="bullet"/>
+      <w:lvlText w:val=""/>
+      <w:lvlJc w:val="left"/>
+      <w:pPr>
+        <w:tabs>
+          <w:tab w:val="num" w:pos="6480"/>
+        </w:tabs>
+        <w:ind w:left="6480" w:hanging="360"/>
+      </w:pPr>
+      <w:rPr>
+        <w:rFonts w:ascii="Wingdings" w:hAnsi="Wingdings" w:hint="default"/>
+        <w:sz w:val="20"/>
+      </w:rPr>
+    </w:lvl>
+  </w:abstractNum>
+  <w:abstractNum w:abstractNumId="11" w15:restartNumberingAfterBreak="0">
     <w:nsid w:val="394544E5"/>
     <w:multiLevelType w:val="hybridMultilevel"/>
     <w:tmpl w:val="9F749B9E"/>
@@ -5255,7 +7428,7 @@
       </w:pPr>
     </w:lvl>
   </w:abstractNum>
-  <w:abstractNum w:abstractNumId="8" w15:restartNumberingAfterBreak="0">
+  <w:abstractNum w:abstractNumId="12" w15:restartNumberingAfterBreak="0">
     <w:nsid w:val="453D7B57"/>
     <w:multiLevelType w:val="multilevel"/>
     <w:tmpl w:val="B06E07FC"/>
@@ -5368,7 +7541,156 @@
       </w:pPr>
     </w:lvl>
   </w:abstractNum>
-  <w:abstractNum w:abstractNumId="9" w15:restartNumberingAfterBreak="0">
+  <w:abstractNum w:abstractNumId="13" w15:restartNumberingAfterBreak="0">
+    <w:nsid w:val="49C83C5F"/>
+    <w:multiLevelType w:val="multilevel"/>
+    <w:tmpl w:val="B8902542"/>
+    <w:lvl w:ilvl="0">
+      <w:start w:val="1"/>
+      <w:numFmt w:val="bullet"/>
+      <w:lvlText w:val=""/>
+      <w:lvlJc w:val="left"/>
+      <w:pPr>
+        <w:tabs>
+          <w:tab w:val="num" w:pos="720"/>
+        </w:tabs>
+        <w:ind w:left="720" w:hanging="360"/>
+      </w:pPr>
+      <w:rPr>
+        <w:rFonts w:ascii="Symbol" w:hAnsi="Symbol" w:hint="default"/>
+        <w:sz w:val="20"/>
+      </w:rPr>
+    </w:lvl>
+    <w:lvl w:ilvl="1" w:tentative="1">
+      <w:start w:val="1"/>
+      <w:numFmt w:val="bullet"/>
+      <w:lvlText w:val="o"/>
+      <w:lvlJc w:val="left"/>
+      <w:pPr>
+        <w:tabs>
+          <w:tab w:val="num" w:pos="1440"/>
+        </w:tabs>
+        <w:ind w:left="1440" w:hanging="360"/>
+      </w:pPr>
+      <w:rPr>
+        <w:rFonts w:ascii="Courier New" w:hAnsi="Courier New" w:hint="default"/>
+        <w:sz w:val="20"/>
+      </w:rPr>
+    </w:lvl>
+    <w:lvl w:ilvl="2" w:tentative="1">
+      <w:start w:val="1"/>
+      <w:numFmt w:val="bullet"/>
+      <w:lvlText w:val=""/>
+      <w:lvlJc w:val="left"/>
+      <w:pPr>
+        <w:tabs>
+          <w:tab w:val="num" w:pos="2160"/>
+        </w:tabs>
+        <w:ind w:left="2160" w:hanging="360"/>
+      </w:pPr>
+      <w:rPr>
+        <w:rFonts w:ascii="Wingdings" w:hAnsi="Wingdings" w:hint="default"/>
+        <w:sz w:val="20"/>
+      </w:rPr>
+    </w:lvl>
+    <w:lvl w:ilvl="3" w:tentative="1">
+      <w:start w:val="1"/>
+      <w:numFmt w:val="bullet"/>
+      <w:lvlText w:val=""/>
+      <w:lvlJc w:val="left"/>
+      <w:pPr>
+        <w:tabs>
+          <w:tab w:val="num" w:pos="2880"/>
+        </w:tabs>
+        <w:ind w:left="2880" w:hanging="360"/>
+      </w:pPr>
+      <w:rPr>
+        <w:rFonts w:ascii="Wingdings" w:hAnsi="Wingdings" w:hint="default"/>
+        <w:sz w:val="20"/>
+      </w:rPr>
+    </w:lvl>
+    <w:lvl w:ilvl="4" w:tentative="1">
+      <w:start w:val="1"/>
+      <w:numFmt w:val="bullet"/>
+      <w:lvlText w:val=""/>
+      <w:lvlJc w:val="left"/>
+      <w:pPr>
+        <w:tabs>
+          <w:tab w:val="num" w:pos="3600"/>
+        </w:tabs>
+        <w:ind w:left="3600" w:hanging="360"/>
+      </w:pPr>
+      <w:rPr>
+        <w:rFonts w:ascii="Wingdings" w:hAnsi="Wingdings" w:hint="default"/>
+        <w:sz w:val="20"/>
+      </w:rPr>
+    </w:lvl>
+    <w:lvl w:ilvl="5" w:tentative="1">
+      <w:start w:val="1"/>
+      <w:numFmt w:val="bullet"/>
+      <w:lvlText w:val=""/>
+      <w:lvlJc w:val="left"/>
+      <w:pPr>
+        <w:tabs>
+          <w:tab w:val="num" w:pos="4320"/>
+        </w:tabs>
+        <w:ind w:left="4320" w:hanging="360"/>
+      </w:pPr>
+      <w:rPr>
+        <w:rFonts w:ascii="Wingdings" w:hAnsi="Wingdings" w:hint="default"/>
+        <w:sz w:val="20"/>
+      </w:rPr>
+    </w:lvl>
+    <w:lvl w:ilvl="6" w:tentative="1">
+      <w:start w:val="1"/>
+      <w:numFmt w:val="bullet"/>
+      <w:lvlText w:val=""/>
+      <w:lvlJc w:val="left"/>
+      <w:pPr>
+        <w:tabs>
+          <w:tab w:val="num" w:pos="5040"/>
+        </w:tabs>
+        <w:ind w:left="5040" w:hanging="360"/>
+      </w:pPr>
+      <w:rPr>
+        <w:rFonts w:ascii="Wingdings" w:hAnsi="Wingdings" w:hint="default"/>
+        <w:sz w:val="20"/>
+      </w:rPr>
+    </w:lvl>
+    <w:lvl w:ilvl="7" w:tentative="1">
+      <w:start w:val="1"/>
+      <w:numFmt w:val="bullet"/>
+      <w:lvlText w:val=""/>
+      <w:lvlJc w:val="left"/>
+      <w:pPr>
+        <w:tabs>
+          <w:tab w:val="num" w:pos="5760"/>
+        </w:tabs>
+        <w:ind w:left="5760" w:hanging="360"/>
+      </w:pPr>
+      <w:rPr>
+        <w:rFonts w:ascii="Wingdings" w:hAnsi="Wingdings" w:hint="default"/>
+        <w:sz w:val="20"/>
+      </w:rPr>
+    </w:lvl>
+    <w:lvl w:ilvl="8" w:tentative="1">
+      <w:start w:val="1"/>
+      <w:numFmt w:val="bullet"/>
+      <w:lvlText w:val=""/>
+      <w:lvlJc w:val="left"/>
+      <w:pPr>
+        <w:tabs>
+          <w:tab w:val="num" w:pos="6480"/>
+        </w:tabs>
+        <w:ind w:left="6480" w:hanging="360"/>
+      </w:pPr>
+      <w:rPr>
+        <w:rFonts w:ascii="Wingdings" w:hAnsi="Wingdings" w:hint="default"/>
+        <w:sz w:val="20"/>
+      </w:rPr>
+    </w:lvl>
+  </w:abstractNum>
+  <w:abstractNum w:abstractNumId="14" w15:restartNumberingAfterBreak="0">
     <w:nsid w:val="51DA4D25"/>
     <w:multiLevelType w:val="hybridMultilevel"/>
     <w:tmpl w:val="B7DAB8EC"/>
@@ -5454,7 +7776,305 @@
       </w:pPr>
     </w:lvl>
   </w:abstractNum>
-  <w:abstractNum w:abstractNumId="10" w15:restartNumberingAfterBreak="0">
+  <w:abstractNum w:abstractNumId="15" w15:restartNumberingAfterBreak="0">
+    <w:nsid w:val="5FC00983"/>
+    <w:multiLevelType w:val="multilevel"/>
+    <w:tmpl w:val="B8902542"/>
+    <w:lvl w:ilvl="0">
+      <w:start w:val="1"/>
+      <w:numFmt w:val="bullet"/>
+      <w:lvlText w:val=""/>
+      <w:lvlJc w:val="left"/>
+      <w:pPr>
+        <w:tabs>
+          <w:tab w:val="num" w:pos="720"/>
+        </w:tabs>
+        <w:ind w:left="720" w:hanging="360"/>
+      </w:pPr>
+      <w:rPr>
+        <w:rFonts w:ascii="Symbol" w:hAnsi="Symbol" w:hint="default"/>
+        <w:sz w:val="20"/>
+      </w:rPr>
+    </w:lvl>
+    <w:lvl w:ilvl="1" w:tentative="1">
+      <w:start w:val="1"/>
+      <w:numFmt w:val="bullet"/>
+      <w:lvlText w:val="o"/>
+      <w:lvlJc w:val="left"/>
+      <w:pPr>
+        <w:tabs>
+          <w:tab w:val="num" w:pos="1440"/>
+        </w:tabs>
+        <w:ind w:left="1440" w:hanging="360"/>
+      </w:pPr>
+      <w:rPr>
+        <w:rFonts w:ascii="Courier New" w:hAnsi="Courier New" w:hint="default"/>
+        <w:sz w:val="20"/>
+      </w:rPr>
+    </w:lvl>
+    <w:lvl w:ilvl="2" w:tentative="1">
+      <w:start w:val="1"/>
+      <w:numFmt w:val="bullet"/>
+      <w:lvlText w:val=""/>
+      <w:lvlJc w:val="left"/>
+      <w:pPr>
+        <w:tabs>
+          <w:tab w:val="num" w:pos="2160"/>
+        </w:tabs>
+        <w:ind w:left="2160" w:hanging="360"/>
+      </w:pPr>
+      <w:rPr>
+        <w:rFonts w:ascii="Wingdings" w:hAnsi="Wingdings" w:hint="default"/>
+        <w:sz w:val="20"/>
+      </w:rPr>
+    </w:lvl>
+    <w:lvl w:ilvl="3" w:tentative="1">
+      <w:start w:val="1"/>
+      <w:numFmt w:val="bullet"/>
+      <w:lvlText w:val=""/>
+      <w:lvlJc w:val="left"/>
+      <w:pPr>
+        <w:tabs>
+          <w:tab w:val="num" w:pos="2880"/>
+        </w:tabs>
+        <w:ind w:left="2880" w:hanging="360"/>
+      </w:pPr>
+      <w:rPr>
+        <w:rFonts w:ascii="Wingdings" w:hAnsi="Wingdings" w:hint="default"/>
+        <w:sz w:val="20"/>
+      </w:rPr>
+    </w:lvl>
+    <w:lvl w:ilvl="4" w:tentative="1">
+      <w:start w:val="1"/>
+      <w:numFmt w:val="bullet"/>
+      <w:lvlText w:val=""/>
+      <w:lvlJc w:val="left"/>
+      <w:pPr>
+        <w:tabs>
+          <w:tab w:val="num" w:pos="3600"/>
+        </w:tabs>
+        <w:ind w:left="3600" w:hanging="360"/>
+      </w:pPr>
+      <w:rPr>
+        <w:rFonts w:ascii="Wingdings" w:hAnsi="Wingdings" w:hint="default"/>
+        <w:sz w:val="20"/>
+      </w:rPr>
+    </w:lvl>
+    <w:lvl w:ilvl="5" w:tentative="1">
+      <w:start w:val="1"/>
+      <w:numFmt w:val="bullet"/>
+      <w:lvlText w:val=""/>
+      <w:lvlJc w:val="left"/>
+      <w:pPr>
+        <w:tabs>
+          <w:tab w:val="num" w:pos="4320"/>
+        </w:tabs>
+        <w:ind w:left="4320" w:hanging="360"/>
+      </w:pPr>
+      <w:rPr>
+        <w:rFonts w:ascii="Wingdings" w:hAnsi="Wingdings" w:hint="default"/>
+        <w:sz w:val="20"/>
+      </w:rPr>
+    </w:lvl>
+    <w:lvl w:ilvl="6" w:tentative="1">
+      <w:start w:val="1"/>
+      <w:numFmt w:val="bullet"/>
+      <w:lvlText w:val=""/>
+      <w:lvlJc w:val="left"/>
+      <w:pPr>
+        <w:tabs>
+          <w:tab w:val="num" w:pos="5040"/>
+        </w:tabs>
+        <w:ind w:left="5040" w:hanging="360"/>
+      </w:pPr>
+      <w:rPr>
+        <w:rFonts w:ascii="Wingdings" w:hAnsi="Wingdings" w:hint="default"/>
+        <w:sz w:val="20"/>
+      </w:rPr>
+    </w:lvl>
+    <w:lvl w:ilvl="7" w:tentative="1">
+      <w:start w:val="1"/>
+      <w:numFmt w:val="bullet"/>
+      <w:lvlText w:val=""/>
+      <w:lvlJc w:val="left"/>
+      <w:pPr>
+        <w:tabs>
+          <w:tab w:val="num" w:pos="5760"/>
+        </w:tabs>
+        <w:ind w:left="5760" w:hanging="360"/>
+      </w:pPr>
+      <w:rPr>
+        <w:rFonts w:ascii="Wingdings" w:hAnsi="Wingdings" w:hint="default"/>
+        <w:sz w:val="20"/>
+      </w:rPr>
+    </w:lvl>
+    <w:lvl w:ilvl="8" w:tentative="1">
+      <w:start w:val="1"/>
+      <w:numFmt w:val="bullet"/>
+      <w:lvlText w:val=""/>
+      <w:lvlJc w:val="left"/>
+      <w:pPr>
+        <w:tabs>
+          <w:tab w:val="num" w:pos="6480"/>
+        </w:tabs>
+        <w:ind w:left="6480" w:hanging="360"/>
+      </w:pPr>
+      <w:rPr>
+        <w:rFonts w:ascii="Wingdings" w:hAnsi="Wingdings" w:hint="default"/>
+        <w:sz w:val="20"/>
+      </w:rPr>
+    </w:lvl>
+  </w:abstractNum>
+  <w:abstractNum w:abstractNumId="16" w15:restartNumberingAfterBreak="0">
+    <w:nsid w:val="683047CA"/>
+    <w:multiLevelType w:val="multilevel"/>
+    <w:tmpl w:val="B8902542"/>
+    <w:lvl w:ilvl="0">
+      <w:start w:val="1"/>
+      <w:numFmt w:val="bullet"/>
+      <w:lvlText w:val=""/>
+      <w:lvlJc w:val="left"/>
+      <w:pPr>
+        <w:tabs>
+          <w:tab w:val="num" w:pos="720"/>
+        </w:tabs>
+        <w:ind w:left="720" w:hanging="360"/>
+      </w:pPr>
+      <w:rPr>
+        <w:rFonts w:ascii="Symbol" w:hAnsi="Symbol" w:hint="default"/>
+        <w:sz w:val="20"/>
+      </w:rPr>
+    </w:lvl>
+    <w:lvl w:ilvl="1" w:tentative="1">
+      <w:start w:val="1"/>
+      <w:numFmt w:val="bullet"/>
+      <w:lvlText w:val="o"/>
+      <w:lvlJc w:val="left"/>
+      <w:pPr>
+        <w:tabs>
+          <w:tab w:val="num" w:pos="1440"/>
+        </w:tabs>
+        <w:ind w:left="1440" w:hanging="360"/>
+      </w:pPr>
+      <w:rPr>
+        <w:rFonts w:ascii="Courier New" w:hAnsi="Courier New" w:hint="default"/>
+        <w:sz w:val="20"/>
+      </w:rPr>
+    </w:lvl>
+    <w:lvl w:ilvl="2" w:tentative="1">
+      <w:start w:val="1"/>
+      <w:numFmt w:val="bullet"/>
+      <w:lvlText w:val=""/>
+      <w:lvlJc w:val="left"/>
+      <w:pPr>
+        <w:tabs>
+          <w:tab w:val="num" w:pos="2160"/>
+        </w:tabs>
+        <w:ind w:left="2160" w:hanging="360"/>
+      </w:pPr>
+      <w:rPr>
+        <w:rFonts w:ascii="Wingdings" w:hAnsi="Wingdings" w:hint="default"/>
+        <w:sz w:val="20"/>
+      </w:rPr>
+    </w:lvl>
+    <w:lvl w:ilvl="3" w:tentative="1">
+      <w:start w:val="1"/>
+      <w:numFmt w:val="bullet"/>
+      <w:lvlText w:val=""/>
+      <w:lvlJc w:val="left"/>
+      <w:pPr>
+        <w:tabs>
+          <w:tab w:val="num" w:pos="2880"/>
+        </w:tabs>
+        <w:ind w:left="2880" w:hanging="360"/>
+      </w:pPr>
+      <w:rPr>
+        <w:rFonts w:ascii="Wingdings" w:hAnsi="Wingdings" w:hint="default"/>
+        <w:sz w:val="20"/>
+      </w:rPr>
+    </w:lvl>
+    <w:lvl w:ilvl="4" w:tentative="1">
+      <w:start w:val="1"/>
+      <w:numFmt w:val="bullet"/>
+      <w:lvlText w:val=""/>
+      <w:lvlJc w:val="left"/>
+      <w:pPr>
+        <w:tabs>
+          <w:tab w:val="num" w:pos="3600"/>
+        </w:tabs>
+        <w:ind w:left="3600" w:hanging="360"/>
+      </w:pPr>
+      <w:rPr>
+        <w:rFonts w:ascii="Wingdings" w:hAnsi="Wingdings" w:hint="default"/>
+        <w:sz w:val="20"/>
+      </w:rPr>
+    </w:lvl>
+    <w:lvl w:ilvl="5" w:tentative="1">
+      <w:start w:val="1"/>
+      <w:numFmt w:val="bullet"/>
+      <w:lvlText w:val=""/>
+      <w:lvlJc w:val="left"/>
+      <w:pPr>
+        <w:tabs>
+          <w:tab w:val="num" w:pos="4320"/>
+        </w:tabs>
+        <w:ind w:left="4320" w:hanging="360"/>
+      </w:pPr>
+      <w:rPr>
+        <w:rFonts w:ascii="Wingdings" w:hAnsi="Wingdings" w:hint="default"/>
+        <w:sz w:val="20"/>
+      </w:rPr>
+    </w:lvl>
+    <w:lvl w:ilvl="6" w:tentative="1">
+      <w:start w:val="1"/>
+      <w:numFmt w:val="bullet"/>
+      <w:lvlText w:val=""/>
+      <w:lvlJc w:val="left"/>
+      <w:pPr>
+        <w:tabs>
+          <w:tab w:val="num" w:pos="5040"/>
+        </w:tabs>
+        <w:ind w:left="5040" w:hanging="360"/>
+      </w:pPr>
+      <w:rPr>
+        <w:rFonts w:ascii="Wingdings" w:hAnsi="Wingdings" w:hint="default"/>
+        <w:sz w:val="20"/>
+      </w:rPr>
+    </w:lvl>
+    <w:lvl w:ilvl="7" w:tentative="1">
+      <w:start w:val="1"/>
+      <w:numFmt w:val="bullet"/>
+      <w:lvlText w:val=""/>
+      <w:lvlJc w:val="left"/>
+      <w:pPr>
+        <w:tabs>
+          <w:tab w:val="num" w:pos="5760"/>
+        </w:tabs>
+        <w:ind w:left="5760" w:hanging="360"/>
+      </w:pPr>
+      <w:rPr>
+        <w:rFonts w:ascii="Wingdings" w:hAnsi="Wingdings" w:hint="default"/>
+        <w:sz w:val="20"/>
+      </w:rPr>
+    </w:lvl>
+    <w:lvl w:ilvl="8" w:tentative="1">
+      <w:start w:val="1"/>
+      <w:numFmt w:val="bullet"/>
+      <w:lvlText w:val=""/>
+      <w:lvlJc w:val="left"/>
+      <w:pPr>
+        <w:tabs>
+          <w:tab w:val="num" w:pos="6480"/>
+        </w:tabs>
+        <w:ind w:left="6480" w:hanging="360"/>
+      </w:pPr>
+      <w:rPr>
+        <w:rFonts w:ascii="Wingdings" w:hAnsi="Wingdings" w:hint="default"/>
+        <w:sz w:val="20"/>
+      </w:rPr>
+    </w:lvl>
+  </w:abstractNum>
+  <w:abstractNum w:abstractNumId="17" w15:restartNumberingAfterBreak="0">
     <w:nsid w:val="72600ED2"/>
     <w:multiLevelType w:val="hybridMultilevel"/>
     <w:tmpl w:val="94F26EE2"/>
@@ -5540,7 +8160,156 @@
       </w:pPr>
     </w:lvl>
   </w:abstractNum>
-  <w:abstractNum w:abstractNumId="11" w15:restartNumberingAfterBreak="0">
+  <w:abstractNum w:abstractNumId="18" w15:restartNumberingAfterBreak="0">
+    <w:nsid w:val="76766E12"/>
+    <w:multiLevelType w:val="multilevel"/>
+    <w:tmpl w:val="B8902542"/>
+    <w:lvl w:ilvl="0">
+      <w:start w:val="1"/>
+      <w:numFmt w:val="bullet"/>
+      <w:lvlText w:val=""/>
+      <w:lvlJc w:val="left"/>
+      <w:pPr>
+        <w:tabs>
+          <w:tab w:val="num" w:pos="720"/>
+        </w:tabs>
+        <w:ind w:left="720" w:hanging="360"/>
+      </w:pPr>
+      <w:rPr>
+        <w:rFonts w:ascii="Symbol" w:hAnsi="Symbol" w:hint="default"/>
+        <w:sz w:val="20"/>
+      </w:rPr>
+    </w:lvl>
+    <w:lvl w:ilvl="1" w:tentative="1">
+      <w:start w:val="1"/>
+      <w:numFmt w:val="bullet"/>
+      <w:lvlText w:val="o"/>
+      <w:lvlJc w:val="left"/>
+      <w:pPr>
+        <w:tabs>
+          <w:tab w:val="num" w:pos="1440"/>
+        </w:tabs>
+        <w:ind w:left="1440" w:hanging="360"/>
+      </w:pPr>
+      <w:rPr>
+        <w:rFonts w:ascii="Courier New" w:hAnsi="Courier New" w:hint="default"/>
+        <w:sz w:val="20"/>
+      </w:rPr>
+    </w:lvl>
+    <w:lvl w:ilvl="2" w:tentative="1">
+      <w:start w:val="1"/>
+      <w:numFmt w:val="bullet"/>
+      <w:lvlText w:val=""/>
+      <w:lvlJc w:val="left"/>
+      <w:pPr>
+        <w:tabs>
+          <w:tab w:val="num" w:pos="2160"/>
+        </w:tabs>
+        <w:ind w:left="2160" w:hanging="360"/>
+      </w:pPr>
+      <w:rPr>
+        <w:rFonts w:ascii="Wingdings" w:hAnsi="Wingdings" w:hint="default"/>
+        <w:sz w:val="20"/>
+      </w:rPr>
+    </w:lvl>
+    <w:lvl w:ilvl="3" w:tentative="1">
+      <w:start w:val="1"/>
+      <w:numFmt w:val="bullet"/>
+      <w:lvlText w:val=""/>
+      <w:lvlJc w:val="left"/>
+      <w:pPr>
+        <w:tabs>
+          <w:tab w:val="num" w:pos="2880"/>
+        </w:tabs>
+        <w:ind w:left="2880" w:hanging="360"/>
+      </w:pPr>
+      <w:rPr>
+        <w:rFonts w:ascii="Wingdings" w:hAnsi="Wingdings" w:hint="default"/>
+        <w:sz w:val="20"/>
+      </w:rPr>
+    </w:lvl>
+    <w:lvl w:ilvl="4" w:tentative="1">
+      <w:start w:val="1"/>
+      <w:numFmt w:val="bullet"/>
+      <w:lvlText w:val=""/>
+      <w:lvlJc w:val="left"/>
+      <w:pPr>
+        <w:tabs>
+          <w:tab w:val="num" w:pos="3600"/>
+        </w:tabs>
+        <w:ind w:left="3600" w:hanging="360"/>
+      </w:pPr>
+      <w:rPr>
+        <w:rFonts w:ascii="Wingdings" w:hAnsi="Wingdings" w:hint="default"/>
+        <w:sz w:val="20"/>
+      </w:rPr>
+    </w:lvl>
+    <w:lvl w:ilvl="5" w:tentative="1">
+      <w:start w:val="1"/>
+      <w:numFmt w:val="bullet"/>
+      <w:lvlText w:val=""/>
+      <w:lvlJc w:val="left"/>
+      <w:pPr>
+        <w:tabs>
+          <w:tab w:val="num" w:pos="4320"/>
+        </w:tabs>
+        <w:ind w:left="4320" w:hanging="360"/>
+      </w:pPr>
+      <w:rPr>
+        <w:rFonts w:ascii="Wingdings" w:hAnsi="Wingdings" w:hint="default"/>
+        <w:sz w:val="20"/>
+      </w:rPr>
+    </w:lvl>
+    <w:lvl w:ilvl="6" w:tentative="1">
+      <w:start w:val="1"/>
+      <w:numFmt w:val="bullet"/>
+      <w:lvlText w:val=""/>
+      <w:lvlJc w:val="left"/>
+      <w:pPr>
+        <w:tabs>
+          <w:tab w:val="num" w:pos="5040"/>
+        </w:tabs>
+        <w:ind w:left="5040" w:hanging="360"/>
+      </w:pPr>
+      <w:rPr>
+        <w:rFonts w:ascii="Wingdings" w:hAnsi="Wingdings" w:hint="default"/>
+        <w:sz w:val="20"/>
+      </w:rPr>
+    </w:lvl>
+    <w:lvl w:ilvl="7" w:tentative="1">
+      <w:start w:val="1"/>
+      <w:numFmt w:val="bullet"/>
+      <w:lvlText w:val=""/>
+      <w:lvlJc w:val="left"/>
+      <w:pPr>
+        <w:tabs>
+          <w:tab w:val="num" w:pos="5760"/>
+        </w:tabs>
+        <w:ind w:left="5760" w:hanging="360"/>
+      </w:pPr>
+      <w:rPr>
+        <w:rFonts w:ascii="Wingdings" w:hAnsi="Wingdings" w:hint="default"/>
+        <w:sz w:val="20"/>
+      </w:rPr>
+    </w:lvl>
+    <w:lvl w:ilvl="8" w:tentative="1">
+      <w:start w:val="1"/>
+      <w:numFmt w:val="bullet"/>
+      <w:lvlText w:val=""/>
+      <w:lvlJc w:val="left"/>
+      <w:pPr>
+        <w:tabs>
+          <w:tab w:val="num" w:pos="6480"/>
+        </w:tabs>
+        <w:ind w:left="6480" w:hanging="360"/>
+      </w:pPr>
+      <w:rPr>
+        <w:rFonts w:ascii="Wingdings" w:hAnsi="Wingdings" w:hint="default"/>
+        <w:sz w:val="20"/>
+      </w:rPr>
+    </w:lvl>
+  </w:abstractNum>
+  <w:abstractNum w:abstractNumId="19" w15:restartNumberingAfterBreak="0">
     <w:nsid w:val="780535B1"/>
     <w:multiLevelType w:val="hybridMultilevel"/>
     <w:tmpl w:val="A5E49B3C"/>
@@ -5626,7 +8395,7 @@
       </w:pPr>
     </w:lvl>
   </w:abstractNum>
-  <w:abstractNum w:abstractNumId="12" w15:restartNumberingAfterBreak="0">
+  <w:abstractNum w:abstractNumId="20" w15:restartNumberingAfterBreak="0">
     <w:nsid w:val="78C55DC7"/>
     <w:multiLevelType w:val="hybridMultilevel"/>
     <w:tmpl w:val="D74AF3B8"/>
@@ -5739,62 +8508,238 @@
       </w:rPr>
     </w:lvl>
   </w:abstractNum>
+  <w:abstractNum w:abstractNumId="21" w15:restartNumberingAfterBreak="0">
+    <w:nsid w:val="7F536321"/>
+    <w:multiLevelType w:val="multilevel"/>
+    <w:tmpl w:val="B8902542"/>
+    <w:lvl w:ilvl="0">
+      <w:start w:val="1"/>
+      <w:numFmt w:val="bullet"/>
+      <w:lvlText w:val=""/>
+      <w:lvlJc w:val="left"/>
+      <w:pPr>
+        <w:tabs>
+          <w:tab w:val="num" w:pos="720"/>
+        </w:tabs>
+        <w:ind w:left="720" w:hanging="360"/>
+      </w:pPr>
+      <w:rPr>
+        <w:rFonts w:ascii="Symbol" w:hAnsi="Symbol" w:hint="default"/>
+        <w:sz w:val="20"/>
+      </w:rPr>
+    </w:lvl>
+    <w:lvl w:ilvl="1" w:tentative="1">
+      <w:start w:val="1"/>
+      <w:numFmt w:val="bullet"/>
+      <w:lvlText w:val="o"/>
+      <w:lvlJc w:val="left"/>
+      <w:pPr>
+        <w:tabs>
+          <w:tab w:val="num" w:pos="1440"/>
+        </w:tabs>
+        <w:ind w:left="1440" w:hanging="360"/>
+      </w:pPr>
+      <w:rPr>
+        <w:rFonts w:ascii="Courier New" w:hAnsi="Courier New" w:hint="default"/>
+        <w:sz w:val="20"/>
+      </w:rPr>
+    </w:lvl>
+    <w:lvl w:ilvl="2" w:tentative="1">
+      <w:start w:val="1"/>
+      <w:numFmt w:val="bullet"/>
+      <w:lvlText w:val=""/>
+      <w:lvlJc w:val="left"/>
+      <w:pPr>
+        <w:tabs>
+          <w:tab w:val="num" w:pos="2160"/>
+        </w:tabs>
+        <w:ind w:left="2160" w:hanging="360"/>
+      </w:pPr>
+      <w:rPr>
+        <w:rFonts w:ascii="Wingdings" w:hAnsi="Wingdings" w:hint="default"/>
+        <w:sz w:val="20"/>
+      </w:rPr>
+    </w:lvl>
+    <w:lvl w:ilvl="3" w:tentative="1">
+      <w:start w:val="1"/>
+      <w:numFmt w:val="bullet"/>
+      <w:lvlText w:val=""/>
+      <w:lvlJc w:val="left"/>
+      <w:pPr>
+        <w:tabs>
+          <w:tab w:val="num" w:pos="2880"/>
+        </w:tabs>
+        <w:ind w:left="2880" w:hanging="360"/>
+      </w:pPr>
+      <w:rPr>
+        <w:rFonts w:ascii="Wingdings" w:hAnsi="Wingdings" w:hint="default"/>
+        <w:sz w:val="20"/>
+      </w:rPr>
+    </w:lvl>
+    <w:lvl w:ilvl="4" w:tentative="1">
+      <w:start w:val="1"/>
+      <w:numFmt w:val="bullet"/>
+      <w:lvlText w:val=""/>
+      <w:lvlJc w:val="left"/>
+      <w:pPr>
+        <w:tabs>
+          <w:tab w:val="num" w:pos="3600"/>
+        </w:tabs>
+        <w:ind w:left="3600" w:hanging="360"/>
+      </w:pPr>
+      <w:rPr>
+        <w:rFonts w:ascii="Wingdings" w:hAnsi="Wingdings" w:hint="default"/>
+        <w:sz w:val="20"/>
+      </w:rPr>
+    </w:lvl>
+    <w:lvl w:ilvl="5" w:tentative="1">
+      <w:start w:val="1"/>
+      <w:numFmt w:val="bullet"/>
+      <w:lvlText w:val=""/>
+      <w:lvlJc w:val="left"/>
+      <w:pPr>
+        <w:tabs>
+          <w:tab w:val="num" w:pos="4320"/>
+        </w:tabs>
+        <w:ind w:left="4320" w:hanging="360"/>
+      </w:pPr>
+      <w:rPr>
+        <w:rFonts w:ascii="Wingdings" w:hAnsi="Wingdings" w:hint="default"/>
+        <w:sz w:val="20"/>
+      </w:rPr>
+    </w:lvl>
+    <w:lvl w:ilvl="6" w:tentative="1">
+      <w:start w:val="1"/>
+      <w:numFmt w:val="bullet"/>
+      <w:lvlText w:val=""/>
+      <w:lvlJc w:val="left"/>
+      <w:pPr>
+        <w:tabs>
+          <w:tab w:val="num" w:pos="5040"/>
+        </w:tabs>
+        <w:ind w:left="5040" w:hanging="360"/>
+      </w:pPr>
+      <w:rPr>
+        <w:rFonts w:ascii="Wingdings" w:hAnsi="Wingdings" w:hint="default"/>
+        <w:sz w:val="20"/>
+      </w:rPr>
+    </w:lvl>
+    <w:lvl w:ilvl="7" w:tentative="1">
+      <w:start w:val="1"/>
+      <w:numFmt w:val="bullet"/>
+      <w:lvlText w:val=""/>
+      <w:lvlJc w:val="left"/>
+      <w:pPr>
+        <w:tabs>
+          <w:tab w:val="num" w:pos="5760"/>
+        </w:tabs>
+        <w:ind w:left="5760" w:hanging="360"/>
+      </w:pPr>
+      <w:rPr>
+        <w:rFonts w:ascii="Wingdings" w:hAnsi="Wingdings" w:hint="default"/>
+        <w:sz w:val="20"/>
+      </w:rPr>
+    </w:lvl>
+    <w:lvl w:ilvl="8" w:tentative="1">
+      <w:start w:val="1"/>
+      <w:numFmt w:val="bullet"/>
+      <w:lvlText w:val=""/>
+      <w:lvlJc w:val="left"/>
+      <w:pPr>
+        <w:tabs>
+          <w:tab w:val="num" w:pos="6480"/>
+        </w:tabs>
+        <w:ind w:left="6480" w:hanging="360"/>
+      </w:pPr>
+      <w:rPr>
+        <w:rFonts w:ascii="Wingdings" w:hAnsi="Wingdings" w:hint="default"/>
+        <w:sz w:val="20"/>
+      </w:rPr>
+    </w:lvl>
+  </w:abstractNum>
   <w:num w:numId="1" w16cid:durableId="2057659798">
+    <w:abstractNumId w:val="9"/>
+  </w:num>
+  <w:num w:numId="2" w16cid:durableId="99107261">
+    <w:abstractNumId w:val="9"/>
+  </w:num>
+  <w:num w:numId="3" w16cid:durableId="454829576">
+    <w:abstractNumId w:val="9"/>
+  </w:num>
+  <w:num w:numId="4" w16cid:durableId="919875635">
+    <w:abstractNumId w:val="9"/>
+  </w:num>
+  <w:num w:numId="5" w16cid:durableId="1989245865">
+    <w:abstractNumId w:val="9"/>
+  </w:num>
+  <w:num w:numId="6" w16cid:durableId="337856889">
+    <w:abstractNumId w:val="9"/>
+  </w:num>
+  <w:num w:numId="7" w16cid:durableId="64649658">
+    <w:abstractNumId w:val="12"/>
+  </w:num>
+  <w:num w:numId="8" w16cid:durableId="1038553662">
+    <w:abstractNumId w:val="3"/>
+  </w:num>
+  <w:num w:numId="9" w16cid:durableId="1578859057">
+    <w:abstractNumId w:val="17"/>
+  </w:num>
+  <w:num w:numId="10" w16cid:durableId="1736052766">
+    <w:abstractNumId w:val="20"/>
+  </w:num>
+  <w:num w:numId="11" w16cid:durableId="202595889">
+    <w:abstractNumId w:val="11"/>
+  </w:num>
+  <w:num w:numId="12" w16cid:durableId="1370842178">
+    <w:abstractNumId w:val="2"/>
+  </w:num>
+  <w:num w:numId="13" w16cid:durableId="34165923">
     <w:abstractNumId w:val="6"/>
   </w:num>
-  <w:num w:numId="2" w16cid:durableId="99107261">
-    <w:abstractNumId w:val="6"/>
-  </w:num>
-  <w:num w:numId="3" w16cid:durableId="454829576">
-    <w:abstractNumId w:val="6"/>
-  </w:num>
-  <w:num w:numId="4" w16cid:durableId="919875635">
-    <w:abstractNumId w:val="6"/>
-  </w:num>
-  <w:num w:numId="5" w16cid:durableId="1989245865">
-    <w:abstractNumId w:val="6"/>
-  </w:num>
-  <w:num w:numId="6" w16cid:durableId="337856889">
-    <w:abstractNumId w:val="6"/>
-  </w:num>
-  <w:num w:numId="7" w16cid:durableId="64649658">
-    <w:abstractNumId w:val="8"/>
-  </w:num>
-  <w:num w:numId="8" w16cid:durableId="1038553662">
-    <w:abstractNumId w:val="2"/>
-  </w:num>
-  <w:num w:numId="9" w16cid:durableId="1578859057">
-    <w:abstractNumId w:val="10"/>
-  </w:num>
-  <w:num w:numId="10" w16cid:durableId="1736052766">
-    <w:abstractNumId w:val="12"/>
-  </w:num>
-  <w:num w:numId="11" w16cid:durableId="202595889">
+  <w:num w:numId="14" w16cid:durableId="2031560830">
     <w:abstractNumId w:val="7"/>
   </w:num>
-  <w:num w:numId="12" w16cid:durableId="1370842178">
-    <w:abstractNumId w:val="1"/>
+  <w:num w:numId="15" w16cid:durableId="2032140677">
+    <w:abstractNumId w:val="19"/>
   </w:num>
-  <w:num w:numId="13" w16cid:durableId="34165923">
+  <w:num w:numId="16" w16cid:durableId="1581671240">
     <w:abstractNumId w:val="4"/>
   </w:num>
-  <w:num w:numId="14" w16cid:durableId="2031560830">
-    <w:abstractNumId w:val="5"/>
-  </w:num>
-  <w:num w:numId="15" w16cid:durableId="2032140677">
-    <w:abstractNumId w:val="11"/>
-  </w:num>
-  <w:num w:numId="16" w16cid:durableId="1581671240">
-    <w:abstractNumId w:val="3"/>
-  </w:num>
   <w:num w:numId="17" w16cid:durableId="977875709">
-    <w:abstractNumId w:val="9"/>
+    <w:abstractNumId w:val="14"/>
   </w:num>
   <w:num w:numId="18" w16cid:durableId="607616550">
-    <w:abstractNumId w:val="1"/>
+    <w:abstractNumId w:val="2"/>
   </w:num>
   <w:num w:numId="19" w16cid:durableId="862212825">
     <w:abstractNumId w:val="0"/>
+  </w:num>
+  <w:num w:numId="20" w16cid:durableId="484708208">
+    <w:abstractNumId w:val="10"/>
+  </w:num>
+  <w:num w:numId="21" w16cid:durableId="2114401265">
+    <w:abstractNumId w:val="18"/>
+  </w:num>
+  <w:num w:numId="22" w16cid:durableId="1187791337">
+    <w:abstractNumId w:val="16"/>
+  </w:num>
+  <w:num w:numId="23" w16cid:durableId="81420376">
+    <w:abstractNumId w:val="8"/>
+  </w:num>
+  <w:num w:numId="24" w16cid:durableId="159737426">
+    <w:abstractNumId w:val="15"/>
+  </w:num>
+  <w:num w:numId="25" w16cid:durableId="1965767138">
+    <w:abstractNumId w:val="5"/>
+  </w:num>
+  <w:num w:numId="26" w16cid:durableId="946346645">
+    <w:abstractNumId w:val="13"/>
+  </w:num>
+  <w:num w:numId="27" w16cid:durableId="1330912721">
+    <w:abstractNumId w:val="1"/>
+  </w:num>
+  <w:num w:numId="28" w16cid:durableId="984699097">
+    <w:abstractNumId w:val="21"/>
   </w:num>
 </w:numbering>
 </file>
@@ -6776,6 +9721,84 @@
       <w14:ligatures w14:val="none"/>
     </w:rPr>
   </w:style>
+  <w:style w:type="character" w:styleId="Strong">
+    <w:name w:val="Strong"/>
+    <w:basedOn w:val="DefaultParagraphFont"/>
+    <w:uiPriority w:val="22"/>
+    <w:qFormat/>
+    <w:rsid w:val="00200542"/>
+    <w:rPr>
+      <w:b/>
+      <w:bCs/>
+    </w:rPr>
+  </w:style>
+  <w:style w:type="paragraph" w:styleId="HTMLPreformatted">
+    <w:name w:val="HTML Preformatted"/>
+    <w:basedOn w:val="Normal"/>
+    <w:link w:val="HTMLPreformattedChar"/>
+    <w:uiPriority w:val="99"/>
+    <w:semiHidden/>
+    <w:unhideWhenUsed/>
+    <w:rsid w:val="00200542"/>
+    <w:pPr>
+      <w:tabs>
+        <w:tab w:val="left" w:pos="916"/>
+        <w:tab w:val="left" w:pos="1832"/>
+        <w:tab w:val="left" w:pos="2748"/>
+        <w:tab w:val="left" w:pos="3664"/>
+        <w:tab w:val="left" w:pos="4580"/>
+        <w:tab w:val="left" w:pos="5496"/>
+        <w:tab w:val="left" w:pos="6412"/>
+        <w:tab w:val="left" w:pos="7328"/>
+        <w:tab w:val="left" w:pos="8244"/>
+        <w:tab w:val="left" w:pos="9160"/>
+        <w:tab w:val="left" w:pos="10076"/>
+        <w:tab w:val="left" w:pos="10992"/>
+        <w:tab w:val="left" w:pos="11908"/>
+        <w:tab w:val="left" w:pos="12824"/>
+        <w:tab w:val="left" w:pos="13740"/>
+        <w:tab w:val="left" w:pos="14656"/>
+      </w:tabs>
+      <w:spacing w:after="0" w:line="240" w:lineRule="auto"/>
+    </w:pPr>
+    <w:rPr>
+      <w:rFonts w:ascii="Courier New" w:eastAsia="Times New Roman" w:hAnsi="Courier New" w:cs="Courier New"/>
+      <w:kern w:val="0"/>
+      <w:sz w:val="20"/>
+      <w:szCs w:val="20"/>
+      <w:lang w:eastAsia="en-GB"/>
+      <w14:ligatures w14:val="none"/>
+    </w:rPr>
+  </w:style>
+  <w:style w:type="character" w:customStyle="1" w:styleId="HTMLPreformattedChar">
+    <w:name w:val="HTML Preformatted Char"/>
+    <w:basedOn w:val="DefaultParagraphFont"/>
+    <w:link w:val="HTMLPreformatted"/>
+    <w:uiPriority w:val="99"/>
+    <w:semiHidden/>
+    <w:rsid w:val="00200542"/>
+    <w:rPr>
+      <w:rFonts w:ascii="Courier New" w:eastAsia="Times New Roman" w:hAnsi="Courier New" w:cs="Courier New"/>
+      <w:kern w:val="0"/>
+      <w:sz w:val="20"/>
+      <w:szCs w:val="20"/>
+      <w:lang w:eastAsia="en-GB"/>
+      <w14:ligatures w14:val="none"/>
+    </w:rPr>
+  </w:style>
+  <w:style w:type="character" w:styleId="HTMLCode">
+    <w:name w:val="HTML Code"/>
+    <w:basedOn w:val="DefaultParagraphFont"/>
+    <w:uiPriority w:val="99"/>
+    <w:semiHidden/>
+    <w:unhideWhenUsed/>
+    <w:rsid w:val="00200542"/>
+    <w:rPr>
+      <w:rFonts w:ascii="Courier New" w:eastAsia="Times New Roman" w:hAnsi="Courier New" w:cs="Courier New"/>
+      <w:sz w:val="20"/>
+      <w:szCs w:val="20"/>
+    </w:rPr>
+  </w:style>
 </w:styles>
 </file>
 

</xml_diff>